<commit_message>
Regenerate the database documentation DOCX and PDF
Render version 1.1 with its diagrams.
</commit_message>
<xml_diff>
--- a/docs/SmartPot_DB_Documentation.docx
+++ b/docs/SmartPot_DB_Documentation.docx
@@ -198,7 +198,7 @@
                 <w:sz w:val="21"/>
                 <w:szCs w:val="21"/>
               </w:rPr>
-              <w:t xml:space="preserve">MongoDB 8 con validación $jsonSchema en nueve colecciones, usuario de la aplicación con permisos mínimos, datos demo opcionales y migración idempotente para bases existentes.</w:t>
+              <w:t xml:space="preserve">MongoDB 8 con validación $jsonSchema en diez colecciones, usuario de la aplicación con permisos mínimos, datos demo opcionales y migración idempotente para bases existentes.</w:t>
             </w:r>
           </w:p>
         </w:tc>
@@ -359,7 +359,7 @@
                 <w:sz w:val="19"/>
                 <w:szCs w:val="19"/>
               </w:rPr>
-              <w:t xml:space="preserve">1.0 · septiembre 2026</w:t>
+              <w:t xml:space="preserve">1.1 · octubre 2026</w:t>
             </w:r>
             <w:r>
               <w:rPr>
@@ -729,7 +729,7 @@
                 <w:sz w:val="17"/>
                 <w:szCs w:val="17"/>
               </w:rPr>
-              <w:t xml:space="preserve">1.0 · septiembre 2026</w:t>
+              <w:t xml:space="preserve">1.1 · octubre 2026</w:t>
             </w:r>
           </w:p>
         </w:tc>
@@ -1480,6 +1480,554 @@
     </w:p>
     <w:p>
       <w:pPr>
+        <w:spacing w:before="80" w:after="0" w:line="240" w:lineRule="auto"/>
+        <w:rPr>
+          <w:sz w:val="8"/>
+        </w:rPr>
+      </w:pPr>
+    </w:p>
+    <w:tbl>
+      <w:tblPr>
+        <w:tblW w:w="9360" w:type="dxa"/>
+        <w:tblInd w:w="0" w:type="dxa"/>
+        <w:tblBorders>
+          <w:top w:val="nil"/>
+          <w:left w:val="nil"/>
+          <w:bottom w:val="nil"/>
+          <w:right w:val="nil"/>
+          <w:insideH w:val="nil"/>
+          <w:insideV w:val="nil"/>
+        </w:tblBorders>
+        <w:tblLayout w:type="fixed"/>
+        <w:tblCellMar>
+          <w:left w:w="0" w:type="dxa"/>
+          <w:right w:w="0" w:type="dxa"/>
+        </w:tblCellMar>
+        <w:tblLook w:val="0000" w:firstRow="0" w:lastRow="0" w:firstColumn="0" w:lastColumn="0" w:noHBand="1" w:noVBand="1"/>
+      </w:tblPr>
+      <w:tblGrid>
+        <w:gridCol w:w="9360"/>
+      </w:tblGrid>
+      <w:tr>
+        <w:trPr>
+          <w:cantSplit/>
+        </w:trPr>
+        <w:tc>
+          <w:tcPr>
+            <w:tcW w:w="9360" w:type="dxa"/>
+            <w:shd w:val="clear" w:color="auto" w:fill="0B3D2B"/>
+            <w:tcMar>
+              <w:top w:w="60" w:type="dxa"/>
+              <w:left w:w="200" w:type="dxa"/>
+              <w:bottom w:w="60" w:type="dxa"/>
+              <w:right w:w="200" w:type="dxa"/>
+            </w:tcMar>
+            <w:vAlign w:val="top"/>
+          </w:tcPr>
+          <w:p>
+            <w:pPr>
+              <w:spacing w:before="0" w:after="0" w:line="240" w:lineRule="auto"/>
+            </w:pPr>
+            <w:r>
+              <w:rPr>
+                <w:b/>
+                <w:bCs/>
+                <w:color w:val="7FDBB0"/>
+                <w:spacing w:val="40"/>
+                <w:sz w:val="14"/>
+                <w:szCs w:val="14"/>
+              </w:rPr>
+              <w:t xml:space="preserve">MERMAID</w:t>
+            </w:r>
+          </w:p>
+        </w:tc>
+      </w:tr>
+    </w:tbl>
+    <w:tbl>
+      <w:tblPr>
+        <w:tblW w:w="9360" w:type="dxa"/>
+        <w:tblInd w:w="0" w:type="dxa"/>
+        <w:tblBorders>
+          <w:top w:val="nil"/>
+          <w:left w:val="nil"/>
+          <w:bottom w:val="nil"/>
+          <w:right w:val="nil"/>
+          <w:insideH w:val="nil"/>
+          <w:insideV w:val="nil"/>
+        </w:tblBorders>
+        <w:tblLayout w:type="fixed"/>
+        <w:tblCellMar>
+          <w:left w:w="0" w:type="dxa"/>
+          <w:right w:w="0" w:type="dxa"/>
+        </w:tblCellMar>
+        <w:tblLook w:val="0000" w:firstRow="0" w:lastRow="0" w:firstColumn="0" w:lastColumn="0" w:noHBand="1" w:noVBand="1"/>
+      </w:tblPr>
+      <w:tblGrid>
+        <w:gridCol w:w="9360"/>
+      </w:tblGrid>
+      <w:tr>
+        <w:trPr>
+          <w:cantSplit/>
+        </w:trPr>
+        <w:tc>
+          <w:tcPr>
+            <w:tcW w:w="9360" w:type="dxa"/>
+            <w:shd w:val="clear" w:color="auto" w:fill="F7FAF8"/>
+            <w:tcMar>
+              <w:top w:w="120" w:type="dxa"/>
+              <w:left w:w="200" w:type="dxa"/>
+              <w:bottom w:w="120" w:type="dxa"/>
+              <w:right w:w="200" w:type="dxa"/>
+            </w:tcMar>
+            <w:vAlign w:val="top"/>
+          </w:tcPr>
+          <w:p>
+            <w:pPr>
+              <w:spacing w:before="0" w:after="0" w:line="252" w:lineRule="auto"/>
+            </w:pPr>
+            <w:r>
+              <w:rPr>
+                <w:rFonts w:ascii="JetBrains Mono" w:hAnsi="JetBrains Mono" w:eastAsia="JetBrains Mono" w:cs="JetBrains Mono"/>
+                <w:color w:val="17261F"/>
+                <w:sz w:val="16"/>
+                <w:szCs w:val="16"/>
+              </w:rPr>
+              <w:t xml:space="preserve">%%{init: {"theme": "base", "fontFamily": "Segoe UI, Arial, sans-serif", "themeVariables": {"fontFamily": "Segoe UI, Arial, sans-serif", "fontSize": "15px", "primaryColor": "#DDF5EA", "primaryTextColor": "#17261F", "primaryBorderColor": "#067A52", "secondaryColor": "#E3F2FB", "secondaryTextColor": "#17261F", "secondaryBorderColor": "#1F6FA0", "tertiaryColor": "#F2F7F4", "tertiaryTextColor": "#17261F", "tertiaryBorderColor": "#D5E3DC", "lineColor": "#5B6B63", "textColor": "#17261F", "mainBkg": "#DDF5EA", "nodeBorder": "#067A52", "clusterBkg": "#F7FAF8", "clusterBorder": "#D5E3DC", "edgeLabelBackground": "#FFFFFF", "actorBkg": "#067A52", "actorBorder": "#0B3D2B", "actorTextColor": "#FFFFFF", "actorLineColor": "#5B6B63", "signalColor": "#17261F", "signalTextColor": "#17261F", "labelBoxBkgColor": "#0B3D2B", "labelBoxBorderColor": "#0B3D2B", "labelTextColor": "#FFFFFF", "loopTextColor": "#0B3D2B", "noteBkgColor": "#FDF4DD", "noteBorderColor": "#C98D12", "noteTextColor": "#17261F", "activationBkgColor": "#DDF5EA", "activationBorderColor": "#067A52", "attributeBackgroundColorOdd": "#FFFFFF", "attributeBackgroundColorEven": "#F2F7F4"}, "layout": "elk", "elk": {"nodePlacementStrategy": "BRANDES_KOEPF", "mergeEdges": false, "cycleBreakingStrategy": "GREEDY"}}}%%</w:t>
+            </w:r>
+          </w:p>
+          <w:p>
+            <w:pPr>
+              <w:spacing w:before="0" w:after="0" w:line="252" w:lineRule="auto"/>
+            </w:pPr>
+            <w:r>
+              <w:rPr>
+                <w:rFonts w:ascii="JetBrains Mono" w:hAnsi="JetBrains Mono" w:eastAsia="JetBrains Mono" w:cs="JetBrains Mono"/>
+                <w:color w:val="17261F"/>
+                <w:sz w:val="16"/>
+                <w:szCs w:val="16"/>
+              </w:rPr>
+              <w:t xml:space="preserve">flowchart LR</w:t>
+            </w:r>
+          </w:p>
+          <w:p>
+            <w:pPr>
+              <w:spacing w:before="0" w:after="0" w:line="252" w:lineRule="auto"/>
+            </w:pPr>
+            <w:r>
+              <w:rPr>
+                <w:rFonts w:ascii="JetBrains Mono" w:hAnsi="JetBrains Mono" w:eastAsia="JetBrains Mono" w:cs="JetBrains Mono"/>
+                <w:color w:val="17261F"/>
+                <w:sz w:val="16"/>
+                <w:szCs w:val="16"/>
+              </w:rPr>
+              <w:t xml:space="preserve">  subgraph imagen["Imagen smartpot-db · mongo:8.0 · usuario 999"]</w:t>
+            </w:r>
+          </w:p>
+          <w:p>
+            <w:pPr>
+              <w:spacing w:before="0" w:after="0" w:line="252" w:lineRule="auto"/>
+            </w:pPr>
+            <w:r>
+              <w:rPr>
+                <w:rFonts w:ascii="JetBrains Mono" w:hAnsi="JetBrains Mono" w:eastAsia="JetBrains Mono" w:cs="JetBrains Mono"/>
+                <w:color w:val="17261F"/>
+                <w:sz w:val="16"/>
+                <w:szCs w:val="16"/>
+              </w:rPr>
+              <w:t xml:space="preserve">    direction TB</w:t>
+            </w:r>
+          </w:p>
+          <w:p>
+            <w:pPr>
+              <w:spacing w:before="0" w:after="0" w:line="252" w:lineRule="auto"/>
+            </w:pPr>
+            <w:r>
+              <w:rPr>
+                <w:rFonts w:ascii="JetBrains Mono" w:hAnsi="JetBrains Mono" w:eastAsia="JetBrains Mono" w:cs="JetBrains Mono"/>
+                <w:color w:val="17261F"/>
+                <w:sz w:val="16"/>
+                <w:szCs w:val="16"/>
+              </w:rPr>
+              <w:t xml:space="preserve">    init1["init/01_app_user.js&lt;br/&gt;usuario smartpot con readWrite"]</w:t>
+            </w:r>
+          </w:p>
+          <w:p>
+            <w:pPr>
+              <w:spacing w:before="0" w:after="0" w:line="252" w:lineRule="auto"/>
+            </w:pPr>
+            <w:r>
+              <w:rPr>
+                <w:rFonts w:ascii="JetBrains Mono" w:hAnsi="JetBrains Mono" w:eastAsia="JetBrains Mono" w:cs="JetBrains Mono"/>
+                <w:color w:val="17261F"/>
+                <w:sz w:val="16"/>
+                <w:szCs w:val="16"/>
+              </w:rPr>
+              <w:t xml:space="preserve">    init2["init/02_collections.js&lt;br/&gt;carga schemas/collections.js"]</w:t>
+            </w:r>
+          </w:p>
+          <w:p>
+            <w:pPr>
+              <w:spacing w:before="0" w:after="0" w:line="252" w:lineRule="auto"/>
+            </w:pPr>
+            <w:r>
+              <w:rPr>
+                <w:rFonts w:ascii="JetBrains Mono" w:hAnsi="JetBrains Mono" w:eastAsia="JetBrains Mono" w:cs="JetBrains Mono"/>
+                <w:color w:val="17261F"/>
+                <w:sz w:val="16"/>
+                <w:szCs w:val="16"/>
+              </w:rPr>
+              <w:t xml:space="preserve">    init3["init/03_demo_data.js&lt;br/&gt;solo con SMARTPOT_SEED_DEMO=true"]</w:t>
+            </w:r>
+          </w:p>
+          <w:p>
+            <w:pPr>
+              <w:spacing w:before="0" w:after="0" w:line="252" w:lineRule="auto"/>
+            </w:pPr>
+            <w:r>
+              <w:rPr>
+                <w:rFonts w:ascii="JetBrains Mono" w:hAnsi="JetBrains Mono" w:eastAsia="JetBrains Mono" w:cs="JetBrains Mono"/>
+                <w:color w:val="17261F"/>
+                <w:sz w:val="16"/>
+                <w:szCs w:val="16"/>
+              </w:rPr>
+              <w:t xml:space="preserve">    schemas["/opt/smartpot/schemas/collections.js&lt;br/&gt;SMARTPOT_SCHEMAS · applySmartPotSchemas"]</w:t>
+            </w:r>
+          </w:p>
+          <w:p>
+            <w:pPr>
+              <w:spacing w:before="0" w:after="0" w:line="252" w:lineRule="auto"/>
+            </w:pPr>
+            <w:r>
+              <w:rPr>
+                <w:rFonts w:ascii="JetBrains Mono" w:hAnsi="JetBrains Mono" w:eastAsia="JetBrains Mono" w:cs="JetBrains Mono"/>
+                <w:color w:val="17261F"/>
+                <w:sz w:val="16"/>
+                <w:szCs w:val="16"/>
+              </w:rPr>
+              <w:t xml:space="preserve">    migrate["/opt/smartpot/migrate.js&lt;br/&gt;base existente · cuenta root del entorno"]</w:t>
+            </w:r>
+          </w:p>
+          <w:p>
+            <w:pPr>
+              <w:spacing w:before="0" w:after="0" w:line="252" w:lineRule="auto"/>
+            </w:pPr>
+            <w:r>
+              <w:rPr>
+                <w:rFonts w:ascii="JetBrains Mono" w:hAnsi="JetBrains Mono" w:eastAsia="JetBrains Mono" w:cs="JetBrains Mono"/>
+                <w:color w:val="17261F"/>
+                <w:sz w:val="16"/>
+                <w:szCs w:val="16"/>
+              </w:rPr>
+              <w:t xml:space="preserve">  end</w:t>
+            </w:r>
+          </w:p>
+          <w:p>
+            <w:pPr>
+              <w:spacing w:before="0" w:after="0" w:line="252" w:lineRule="auto"/>
+            </w:pPr>
+            <w:r>
+              <w:rPr>
+                <w:rFonts w:ascii="JetBrains Mono" w:hAnsi="JetBrains Mono" w:eastAsia="JetBrains Mono" w:cs="JetBrains Mono"/>
+                <w:color w:val="17261F"/>
+                <w:sz w:val="16"/>
+                <w:szCs w:val="16"/>
+              </w:rPr>
+              <w:t xml:space="preserve">  volume[("Volumen de datos&lt;br/&gt;/data/db")]</w:t>
+            </w:r>
+          </w:p>
+          <w:p>
+            <w:pPr>
+              <w:spacing w:before="0" w:after="0" w:line="252" w:lineRule="auto"/>
+            </w:pPr>
+            <w:r>
+              <w:rPr>
+                <w:rFonts w:ascii="JetBrains Mono" w:hAnsi="JetBrains Mono" w:eastAsia="JetBrains Mono" w:cs="JetBrains Mono"/>
+                <w:color w:val="17261F"/>
+                <w:sz w:val="16"/>
+                <w:szCs w:val="16"/>
+              </w:rPr>
+              <w:t xml:space="preserve">  api["SmartPot-API&lt;br/&gt;usuario smartpot&lt;br/&gt;crea los índices"]</w:t>
+            </w:r>
+          </w:p>
+          <w:p>
+            <w:pPr>
+              <w:spacing w:before="0" w:after="0" w:line="252" w:lineRule="auto"/>
+            </w:pPr>
+            <w:r>
+              <w:rPr>
+                <w:rFonts w:ascii="JetBrains Mono" w:hAnsi="JetBrains Mono" w:eastAsia="JetBrains Mono" w:cs="JetBrains Mono"/>
+                <w:color w:val="17261F"/>
+                <w:sz w:val="16"/>
+                <w:szCs w:val="16"/>
+              </w:rPr>
+              <w:t xml:space="preserve">  deploy["deploy.yml central&lt;br/&gt;tras up --wait"]</w:t>
+            </w:r>
+          </w:p>
+          <w:p>
+            <w:pPr>
+              <w:spacing w:before="0" w:after="0" w:line="252" w:lineRule="auto"/>
+            </w:pPr>
+            <w:r>
+              <w:rPr>
+                <w:rFonts w:ascii="JetBrains Mono" w:hAnsi="JetBrains Mono" w:eastAsia="JetBrains Mono" w:cs="JetBrains Mono"/>
+                <w:color w:val="17261F"/>
+                <w:sz w:val="16"/>
+                <w:szCs w:val="16"/>
+              </w:rPr>
+              <w:t xml:space="preserve">  init1 &amp; init2 &amp; init3 --&gt;|"solo con el volumen vacío"| volume</w:t>
+            </w:r>
+          </w:p>
+          <w:p>
+            <w:pPr>
+              <w:spacing w:before="0" w:after="0" w:line="252" w:lineRule="auto"/>
+            </w:pPr>
+            <w:r>
+              <w:rPr>
+                <w:rFonts w:ascii="JetBrains Mono" w:hAnsi="JetBrains Mono" w:eastAsia="JetBrains Mono" w:cs="JetBrains Mono"/>
+                <w:color w:val="17261F"/>
+                <w:sz w:val="16"/>
+                <w:szCs w:val="16"/>
+              </w:rPr>
+              <w:t xml:space="preserve">  init2 --&gt; schemas</w:t>
+            </w:r>
+          </w:p>
+          <w:p>
+            <w:pPr>
+              <w:spacing w:before="0" w:after="0" w:line="252" w:lineRule="auto"/>
+            </w:pPr>
+            <w:r>
+              <w:rPr>
+                <w:rFonts w:ascii="JetBrains Mono" w:hAnsi="JetBrains Mono" w:eastAsia="JetBrains Mono" w:cs="JetBrains Mono"/>
+                <w:color w:val="17261F"/>
+                <w:sz w:val="16"/>
+                <w:szCs w:val="16"/>
+              </w:rPr>
+              <w:t xml:space="preserve">  migrate --&gt; schemas</w:t>
+            </w:r>
+          </w:p>
+          <w:p>
+            <w:pPr>
+              <w:spacing w:before="0" w:after="0" w:line="252" w:lineRule="auto"/>
+            </w:pPr>
+            <w:r>
+              <w:rPr>
+                <w:rFonts w:ascii="JetBrains Mono" w:hAnsi="JetBrains Mono" w:eastAsia="JetBrains Mono" w:cs="JetBrains Mono"/>
+                <w:color w:val="17261F"/>
+                <w:sz w:val="16"/>
+                <w:szCs w:val="16"/>
+              </w:rPr>
+              <w:t xml:space="preserve">  schemas --&gt;|"create o collMod"| volume</w:t>
+            </w:r>
+          </w:p>
+          <w:p>
+            <w:pPr>
+              <w:spacing w:before="0" w:after="0" w:line="252" w:lineRule="auto"/>
+            </w:pPr>
+            <w:r>
+              <w:rPr>
+                <w:rFonts w:ascii="JetBrains Mono" w:hAnsi="JetBrains Mono" w:eastAsia="JetBrains Mono" w:cs="JetBrains Mono"/>
+                <w:color w:val="17261F"/>
+                <w:sz w:val="16"/>
+                <w:szCs w:val="16"/>
+              </w:rPr>
+              <w:t xml:space="preserve">  deploy --&gt;|"docker compose exec mongosh"| migrate</w:t>
+            </w:r>
+          </w:p>
+          <w:p>
+            <w:pPr>
+              <w:spacing w:before="0" w:after="0" w:line="252" w:lineRule="auto"/>
+            </w:pPr>
+            <w:r>
+              <w:rPr>
+                <w:rFonts w:ascii="JetBrains Mono" w:hAnsi="JetBrains Mono" w:eastAsia="JetBrains Mono" w:cs="JetBrains Mono"/>
+                <w:color w:val="17261F"/>
+                <w:sz w:val="16"/>
+                <w:szCs w:val="16"/>
+              </w:rPr>
+              <w:t xml:space="preserve">  api --&gt;|"readWrite sobre smartpot"| volume</w:t>
+            </w:r>
+          </w:p>
+          <w:p>
+            <w:pPr>
+              <w:spacing w:before="0" w:after="0" w:line="252" w:lineRule="auto"/>
+            </w:pPr>
+            <w:r>
+              <w:rPr>
+                <w:rFonts w:ascii="JetBrains Mono" w:hAnsi="JetBrains Mono" w:eastAsia="JetBrains Mono" w:cs="JetBrains Mono"/>
+                <w:color w:val="17261F"/>
+                <w:sz w:val="16"/>
+                <w:szCs w:val="16"/>
+              </w:rPr>
+              <w:t xml:space="preserve">  classDef leaf fill:#DDF5EA,stroke:#067A52,color:#17261F</w:t>
+            </w:r>
+          </w:p>
+          <w:p>
+            <w:pPr>
+              <w:spacing w:before="0" w:after="0" w:line="252" w:lineRule="auto"/>
+            </w:pPr>
+            <w:r>
+              <w:rPr>
+                <w:rFonts w:ascii="JetBrains Mono" w:hAnsi="JetBrains Mono" w:eastAsia="JetBrains Mono" w:cs="JetBrains Mono"/>
+                <w:color w:val="17261F"/>
+                <w:sz w:val="16"/>
+                <w:szCs w:val="16"/>
+              </w:rPr>
+              <w:t xml:space="preserve">  classDef water fill:#E3F2FB,stroke:#1F6FA0,color:#17261F</w:t>
+            </w:r>
+          </w:p>
+          <w:p>
+            <w:pPr>
+              <w:spacing w:before="0" w:after="0" w:line="252" w:lineRule="auto"/>
+            </w:pPr>
+            <w:r>
+              <w:rPr>
+                <w:rFonts w:ascii="JetBrains Mono" w:hAnsi="JetBrains Mono" w:eastAsia="JetBrains Mono" w:cs="JetBrains Mono"/>
+                <w:color w:val="17261F"/>
+                <w:sz w:val="16"/>
+                <w:szCs w:val="16"/>
+              </w:rPr>
+              <w:t xml:space="preserve">  classDef sun fill:#FDF4DD,stroke:#C98D12,color:#17261F</w:t>
+            </w:r>
+          </w:p>
+          <w:p>
+            <w:pPr>
+              <w:spacing w:before="0" w:after="0" w:line="252" w:lineRule="auto"/>
+            </w:pPr>
+            <w:r>
+              <w:rPr>
+                <w:rFonts w:ascii="JetBrains Mono" w:hAnsi="JetBrains Mono" w:eastAsia="JetBrains Mono" w:cs="JetBrains Mono"/>
+                <w:color w:val="17261F"/>
+                <w:sz w:val="16"/>
+                <w:szCs w:val="16"/>
+              </w:rPr>
+              <w:t xml:space="preserve">  classDef clay fill:#FBE9E1,stroke:#B85A38,color:#17261F</w:t>
+            </w:r>
+          </w:p>
+          <w:p>
+            <w:pPr>
+              <w:spacing w:before="0" w:after="0" w:line="252" w:lineRule="auto"/>
+            </w:pPr>
+            <w:r>
+              <w:rPr>
+                <w:rFonts w:ascii="JetBrains Mono" w:hAnsi="JetBrains Mono" w:eastAsia="JetBrains Mono" w:cs="JetBrains Mono"/>
+                <w:color w:val="17261F"/>
+                <w:sz w:val="16"/>
+                <w:szCs w:val="16"/>
+              </w:rPr>
+              <w:t xml:space="preserve">  classDef core fill:#067A52,stroke:#0B3D2B,color:#FFFFFF</w:t>
+            </w:r>
+          </w:p>
+          <w:p>
+            <w:pPr>
+              <w:spacing w:before="0" w:after="0" w:line="252" w:lineRule="auto"/>
+            </w:pPr>
+            <w:r>
+              <w:rPr>
+                <w:rFonts w:ascii="JetBrains Mono" w:hAnsi="JetBrains Mono" w:eastAsia="JetBrains Mono" w:cs="JetBrains Mono"/>
+                <w:color w:val="17261F"/>
+                <w:sz w:val="16"/>
+                <w:szCs w:val="16"/>
+              </w:rPr>
+              <w:t xml:space="preserve">  classDef deep fill:#0B3D2B,stroke:#06281C,color:#FFFFFF</w:t>
+            </w:r>
+          </w:p>
+          <w:p>
+            <w:pPr>
+              <w:spacing w:before="0" w:after="0" w:line="252" w:lineRule="auto"/>
+            </w:pPr>
+            <w:r>
+              <w:rPr>
+                <w:rFonts w:ascii="JetBrains Mono" w:hAnsi="JetBrains Mono" w:eastAsia="JetBrains Mono" w:cs="JetBrains Mono"/>
+                <w:color w:val="17261F"/>
+                <w:sz w:val="16"/>
+                <w:szCs w:val="16"/>
+              </w:rPr>
+              <w:t xml:space="preserve">  classDef muted fill:#F2F7F4,stroke:#5B6B63,color:#17261F</w:t>
+            </w:r>
+          </w:p>
+          <w:p>
+            <w:pPr>
+              <w:spacing w:before="0" w:after="0" w:line="252" w:lineRule="auto"/>
+            </w:pPr>
+            <w:r>
+              <w:rPr>
+                <w:rFonts w:ascii="JetBrains Mono" w:hAnsi="JetBrains Mono" w:eastAsia="JetBrains Mono" w:cs="JetBrains Mono"/>
+                <w:color w:val="17261F"/>
+                <w:sz w:val="16"/>
+                <w:szCs w:val="16"/>
+              </w:rPr>
+              <w:t xml:space="preserve">  class init1,init2,init3 leaf</w:t>
+            </w:r>
+          </w:p>
+          <w:p>
+            <w:pPr>
+              <w:spacing w:before="0" w:after="0" w:line="252" w:lineRule="auto"/>
+            </w:pPr>
+            <w:r>
+              <w:rPr>
+                <w:rFonts w:ascii="JetBrains Mono" w:hAnsi="JetBrains Mono" w:eastAsia="JetBrains Mono" w:cs="JetBrains Mono"/>
+                <w:color w:val="17261F"/>
+                <w:sz w:val="16"/>
+                <w:szCs w:val="16"/>
+              </w:rPr>
+              <w:t xml:space="preserve">  class schemas core</w:t>
+            </w:r>
+          </w:p>
+          <w:p>
+            <w:pPr>
+              <w:spacing w:before="0" w:after="0" w:line="252" w:lineRule="auto"/>
+            </w:pPr>
+            <w:r>
+              <w:rPr>
+                <w:rFonts w:ascii="JetBrains Mono" w:hAnsi="JetBrains Mono" w:eastAsia="JetBrains Mono" w:cs="JetBrains Mono"/>
+                <w:color w:val="17261F"/>
+                <w:sz w:val="16"/>
+                <w:szCs w:val="16"/>
+              </w:rPr>
+              <w:t xml:space="preserve">  class migrate sun</w:t>
+            </w:r>
+          </w:p>
+          <w:p>
+            <w:pPr>
+              <w:spacing w:before="0" w:after="0" w:line="252" w:lineRule="auto"/>
+            </w:pPr>
+            <w:r>
+              <w:rPr>
+                <w:rFonts w:ascii="JetBrains Mono" w:hAnsi="JetBrains Mono" w:eastAsia="JetBrains Mono" w:cs="JetBrains Mono"/>
+                <w:color w:val="17261F"/>
+                <w:sz w:val="16"/>
+                <w:szCs w:val="16"/>
+              </w:rPr>
+              <w:t xml:space="preserve">  class volume muted</w:t>
+            </w:r>
+          </w:p>
+          <w:p>
+            <w:pPr>
+              <w:spacing w:before="0" w:after="0" w:line="252" w:lineRule="auto"/>
+            </w:pPr>
+            <w:r>
+              <w:rPr>
+                <w:rFonts w:ascii="JetBrains Mono" w:hAnsi="JetBrains Mono" w:eastAsia="JetBrains Mono" w:cs="JetBrains Mono"/>
+                <w:color w:val="17261F"/>
+                <w:sz w:val="16"/>
+                <w:szCs w:val="16"/>
+              </w:rPr>
+              <w:t xml:space="preserve">  class api,deploy water</w:t>
+            </w:r>
+          </w:p>
+        </w:tc>
+      </w:tr>
+    </w:tbl>
+    <w:p>
+      <w:pPr>
+        <w:spacing w:before="160" w:after="0" w:line="240" w:lineRule="auto"/>
+        <w:rPr>
+          <w:sz w:val="8"/>
+        </w:rPr>
+      </w:pPr>
+    </w:p>
+    <w:p>
+      <w:pPr>
         <w:keepNext/>
         <w:spacing w:before="360" w:after="40" w:line="288" w:lineRule="auto"/>
       </w:pPr>
@@ -1521,7 +2069,7 @@
       <w:r>
         <w:drawing>
           <wp:inline distT="0" distB="0" distL="0" distR="0">
-            <wp:extent cx="5943600" cy="4105329"/>
+            <wp:extent cx="5943600" cy="4075974"/>
             <wp:docPr id="109" name="SmartPot_DB_01_Collections"/>
             <wp:cNvGraphicFramePr>
               <a:graphicFrameLocks noChangeAspect="1"/>
@@ -1542,7 +2090,7 @@
                   <pic:spPr>
                     <a:xfrm>
                       <a:off x="0" y="0"/>
-                      <a:ext cx="5943600" cy="4105329"/>
+                      <a:ext cx="5943600" cy="4075974"/>
                     </a:xfrm>
                     <a:prstGeom prst="rect">
                       <a:avLst/>
@@ -1583,6 +2131,764 @@
     </w:p>
     <w:p>
       <w:pPr>
+        <w:spacing w:before="80" w:after="0" w:line="240" w:lineRule="auto"/>
+        <w:rPr>
+          <w:sz w:val="8"/>
+        </w:rPr>
+      </w:pPr>
+    </w:p>
+    <w:tbl>
+      <w:tblPr>
+        <w:tblW w:w="9360" w:type="dxa"/>
+        <w:tblInd w:w="0" w:type="dxa"/>
+        <w:tblBorders>
+          <w:top w:val="nil"/>
+          <w:left w:val="nil"/>
+          <w:bottom w:val="nil"/>
+          <w:right w:val="nil"/>
+          <w:insideH w:val="nil"/>
+          <w:insideV w:val="nil"/>
+        </w:tblBorders>
+        <w:tblLayout w:type="fixed"/>
+        <w:tblCellMar>
+          <w:left w:w="0" w:type="dxa"/>
+          <w:right w:w="0" w:type="dxa"/>
+        </w:tblCellMar>
+        <w:tblLook w:val="0000" w:firstRow="0" w:lastRow="0" w:firstColumn="0" w:lastColumn="0" w:noHBand="1" w:noVBand="1"/>
+      </w:tblPr>
+      <w:tblGrid>
+        <w:gridCol w:w="9360"/>
+      </w:tblGrid>
+      <w:tr>
+        <w:trPr>
+          <w:cantSplit/>
+        </w:trPr>
+        <w:tc>
+          <w:tcPr>
+            <w:tcW w:w="9360" w:type="dxa"/>
+            <w:shd w:val="clear" w:color="auto" w:fill="0B3D2B"/>
+            <w:tcMar>
+              <w:top w:w="60" w:type="dxa"/>
+              <w:left w:w="200" w:type="dxa"/>
+              <w:bottom w:w="60" w:type="dxa"/>
+              <w:right w:w="200" w:type="dxa"/>
+            </w:tcMar>
+            <w:vAlign w:val="top"/>
+          </w:tcPr>
+          <w:p>
+            <w:pPr>
+              <w:spacing w:before="0" w:after="0" w:line="240" w:lineRule="auto"/>
+            </w:pPr>
+            <w:r>
+              <w:rPr>
+                <w:b/>
+                <w:bCs/>
+                <w:color w:val="7FDBB0"/>
+                <w:spacing w:val="40"/>
+                <w:sz w:val="14"/>
+                <w:szCs w:val="14"/>
+              </w:rPr>
+              <w:t xml:space="preserve">MERMAID</w:t>
+            </w:r>
+          </w:p>
+        </w:tc>
+      </w:tr>
+    </w:tbl>
+    <w:tbl>
+      <w:tblPr>
+        <w:tblW w:w="9360" w:type="dxa"/>
+        <w:tblInd w:w="0" w:type="dxa"/>
+        <w:tblBorders>
+          <w:top w:val="nil"/>
+          <w:left w:val="nil"/>
+          <w:bottom w:val="nil"/>
+          <w:right w:val="nil"/>
+          <w:insideH w:val="nil"/>
+          <w:insideV w:val="nil"/>
+        </w:tblBorders>
+        <w:tblLayout w:type="fixed"/>
+        <w:tblCellMar>
+          <w:left w:w="0" w:type="dxa"/>
+          <w:right w:w="0" w:type="dxa"/>
+        </w:tblCellMar>
+        <w:tblLook w:val="0000" w:firstRow="0" w:lastRow="0" w:firstColumn="0" w:lastColumn="0" w:noHBand="1" w:noVBand="1"/>
+      </w:tblPr>
+      <w:tblGrid>
+        <w:gridCol w:w="9360"/>
+      </w:tblGrid>
+      <w:tr>
+        <w:trPr>
+          <w:cantSplit/>
+        </w:trPr>
+        <w:tc>
+          <w:tcPr>
+            <w:tcW w:w="9360" w:type="dxa"/>
+            <w:shd w:val="clear" w:color="auto" w:fill="F7FAF8"/>
+            <w:tcMar>
+              <w:top w:w="120" w:type="dxa"/>
+              <w:left w:w="200" w:type="dxa"/>
+              <w:bottom w:w="120" w:type="dxa"/>
+              <w:right w:w="200" w:type="dxa"/>
+            </w:tcMar>
+            <w:vAlign w:val="top"/>
+          </w:tcPr>
+          <w:p>
+            <w:pPr>
+              <w:spacing w:before="0" w:after="0" w:line="252" w:lineRule="auto"/>
+            </w:pPr>
+            <w:r>
+              <w:rPr>
+                <w:rFonts w:ascii="JetBrains Mono" w:hAnsi="JetBrains Mono" w:eastAsia="JetBrains Mono" w:cs="JetBrains Mono"/>
+                <w:color w:val="17261F"/>
+                <w:sz w:val="16"/>
+                <w:szCs w:val="16"/>
+              </w:rPr>
+              <w:t xml:space="preserve">%%{init: {"theme": "base", "fontFamily": "Segoe UI, Arial, sans-serif", "themeVariables": {"fontFamily": "Segoe UI, Arial, sans-serif", "fontSize": "15px", "primaryColor": "#DDF5EA", "primaryTextColor": "#17261F", "primaryBorderColor": "#067A52", "secondaryColor": "#E3F2FB", "secondaryTextColor": "#17261F", "secondaryBorderColor": "#1F6FA0", "tertiaryColor": "#F2F7F4", "tertiaryTextColor": "#17261F", "tertiaryBorderColor": "#D5E3DC", "lineColor": "#5B6B63", "textColor": "#17261F", "mainBkg": "#DDF5EA", "nodeBorder": "#067A52", "clusterBkg": "#F7FAF8", "clusterBorder": "#D5E3DC", "edgeLabelBackground": "#FFFFFF", "actorBkg": "#067A52", "actorBorder": "#0B3D2B", "actorTextColor": "#FFFFFF", "actorLineColor": "#5B6B63", "signalColor": "#17261F", "signalTextColor": "#17261F", "labelBoxBkgColor": "#0B3D2B", "labelBoxBorderColor": "#0B3D2B", "labelTextColor": "#FFFFFF", "loopTextColor": "#0B3D2B", "noteBkgColor": "#FDF4DD", "noteBorderColor": "#C98D12", "noteTextColor": "#17261F", "activationBkgColor": "#DDF5EA", "activationBorderColor": "#067A52", "attributeBackgroundColorOdd": "#FFFFFF", "attributeBackgroundColorEven": "#F2F7F4"}}}%%</w:t>
+            </w:r>
+          </w:p>
+          <w:p>
+            <w:pPr>
+              <w:spacing w:before="0" w:after="0" w:line="252" w:lineRule="auto"/>
+            </w:pPr>
+            <w:r>
+              <w:rPr>
+                <w:rFonts w:ascii="JetBrains Mono" w:hAnsi="JetBrains Mono" w:eastAsia="JetBrains Mono" w:cs="JetBrains Mono"/>
+                <w:color w:val="17261F"/>
+                <w:sz w:val="16"/>
+                <w:szCs w:val="16"/>
+              </w:rPr>
+              <w:t xml:space="preserve">erDiagram</w:t>
+            </w:r>
+          </w:p>
+          <w:p>
+            <w:pPr>
+              <w:spacing w:before="0" w:after="0" w:line="252" w:lineRule="auto"/>
+            </w:pPr>
+            <w:r>
+              <w:rPr>
+                <w:rFonts w:ascii="JetBrains Mono" w:hAnsi="JetBrains Mono" w:eastAsia="JetBrains Mono" w:cs="JetBrains Mono"/>
+                <w:color w:val="17261F"/>
+                <w:sz w:val="16"/>
+                <w:szCs w:val="16"/>
+              </w:rPr>
+              <w:t xml:space="preserve">  USERS ||--o{ CROPS : "es dueño de"</w:t>
+            </w:r>
+          </w:p>
+          <w:p>
+            <w:pPr>
+              <w:spacing w:before="0" w:after="0" w:line="252" w:lineRule="auto"/>
+            </w:pPr>
+            <w:r>
+              <w:rPr>
+                <w:rFonts w:ascii="JetBrains Mono" w:hAnsi="JetBrains Mono" w:eastAsia="JetBrains Mono" w:cs="JetBrains Mono"/>
+                <w:color w:val="17261F"/>
+                <w:sz w:val="16"/>
+                <w:szCs w:val="16"/>
+              </w:rPr>
+              <w:t xml:space="preserve">  USERS ||--o{ NOTIFICATIONS : "recibe"</w:t>
+            </w:r>
+          </w:p>
+          <w:p>
+            <w:pPr>
+              <w:spacing w:before="0" w:after="0" w:line="252" w:lineRule="auto"/>
+            </w:pPr>
+            <w:r>
+              <w:rPr>
+                <w:rFonts w:ascii="JetBrains Mono" w:hAnsi="JetBrains Mono" w:eastAsia="JetBrains Mono" w:cs="JetBrains Mono"/>
+                <w:color w:val="17261F"/>
+                <w:sz w:val="16"/>
+                <w:szCs w:val="16"/>
+              </w:rPr>
+              <w:t xml:space="preserve">  USERS ||--o{ PASSWORD_RESET_TOKENS : "solicita"</w:t>
+            </w:r>
+          </w:p>
+          <w:p>
+            <w:pPr>
+              <w:spacing w:before="0" w:after="0" w:line="252" w:lineRule="auto"/>
+            </w:pPr>
+            <w:r>
+              <w:rPr>
+                <w:rFonts w:ascii="JetBrains Mono" w:hAnsi="JetBrains Mono" w:eastAsia="JetBrains Mono" w:cs="JetBrains Mono"/>
+                <w:color w:val="17261F"/>
+                <w:sz w:val="16"/>
+                <w:szCs w:val="16"/>
+              </w:rPr>
+              <w:t xml:space="preserve">  USERS ||--o{ CHANNEL_LINKS : "vincula"</w:t>
+            </w:r>
+          </w:p>
+          <w:p>
+            <w:pPr>
+              <w:spacing w:before="0" w:after="0" w:line="252" w:lineRule="auto"/>
+            </w:pPr>
+            <w:r>
+              <w:rPr>
+                <w:rFonts w:ascii="JetBrains Mono" w:hAnsi="JetBrains Mono" w:eastAsia="JetBrains Mono" w:cs="JetBrains Mono"/>
+                <w:color w:val="17261F"/>
+                <w:sz w:val="16"/>
+                <w:szCs w:val="16"/>
+              </w:rPr>
+              <w:t xml:space="preserve">  CROPS ||--o{ READINGS : "registra"</w:t>
+            </w:r>
+          </w:p>
+          <w:p>
+            <w:pPr>
+              <w:spacing w:before="0" w:after="0" w:line="252" w:lineRule="auto"/>
+            </w:pPr>
+            <w:r>
+              <w:rPr>
+                <w:rFonts w:ascii="JetBrains Mono" w:hAnsi="JetBrains Mono" w:eastAsia="JetBrains Mono" w:cs="JetBrains Mono"/>
+                <w:color w:val="17261F"/>
+                <w:sz w:val="16"/>
+                <w:szCs w:val="16"/>
+              </w:rPr>
+              <w:t xml:space="preserve">  CROPS ||--o{ ACTUATORS : "tiene"</w:t>
+            </w:r>
+          </w:p>
+          <w:p>
+            <w:pPr>
+              <w:spacing w:before="0" w:after="0" w:line="252" w:lineRule="auto"/>
+            </w:pPr>
+            <w:r>
+              <w:rPr>
+                <w:rFonts w:ascii="JetBrains Mono" w:hAnsi="JetBrains Mono" w:eastAsia="JetBrains Mono" w:cs="JetBrains Mono"/>
+                <w:color w:val="17261F"/>
+                <w:sz w:val="16"/>
+                <w:szCs w:val="16"/>
+              </w:rPr>
+              <w:t xml:space="preserve">  CROPS ||--o{ COMMANDS : "recibe"</w:t>
+            </w:r>
+          </w:p>
+          <w:p>
+            <w:pPr>
+              <w:spacing w:before="0" w:after="0" w:line="252" w:lineRule="auto"/>
+            </w:pPr>
+            <w:r>
+              <w:rPr>
+                <w:rFonts w:ascii="JetBrains Mono" w:hAnsi="JetBrains Mono" w:eastAsia="JetBrains Mono" w:cs="JetBrains Mono"/>
+                <w:color w:val="17261F"/>
+                <w:sz w:val="16"/>
+                <w:szCs w:val="16"/>
+              </w:rPr>
+              <w:t xml:space="preserve">  CROPS ||--o{ CROP_CHANNELS : "avisa por"</w:t>
+            </w:r>
+          </w:p>
+          <w:p>
+            <w:pPr>
+              <w:spacing w:before="0" w:after="0" w:line="252" w:lineRule="auto"/>
+            </w:pPr>
+            <w:r>
+              <w:rPr>
+                <w:rFonts w:ascii="JetBrains Mono" w:hAnsi="JetBrains Mono" w:eastAsia="JetBrains Mono" w:cs="JetBrains Mono"/>
+                <w:color w:val="17261F"/>
+                <w:sz w:val="16"/>
+                <w:szCs w:val="16"/>
+              </w:rPr>
+              <w:t xml:space="preserve">  CROPS ||--o| VIRTUAL_DEVICES : "simula si es virtual"</w:t>
+            </w:r>
+          </w:p>
+          <w:p>
+            <w:pPr>
+              <w:spacing w:before="0" w:after="0" w:line="252" w:lineRule="auto"/>
+            </w:pPr>
+            <w:r>
+              <w:rPr>
+                <w:rFonts w:ascii="JetBrains Mono" w:hAnsi="JetBrains Mono" w:eastAsia="JetBrains Mono" w:cs="JetBrains Mono"/>
+                <w:color w:val="17261F"/>
+                <w:sz w:val="16"/>
+                <w:szCs w:val="16"/>
+              </w:rPr>
+              <w:t xml:space="preserve">  ACTUATORS ||--o{ COMMANDS : "ejecuta"</w:t>
+            </w:r>
+          </w:p>
+          <w:p>
+            <w:pPr>
+              <w:spacing w:before="0" w:after="0" w:line="252" w:lineRule="auto"/>
+            </w:pPr>
+            <w:r>
+              <w:rPr>
+                <w:rFonts w:ascii="JetBrains Mono" w:hAnsi="JetBrains Mono" w:eastAsia="JetBrains Mono" w:cs="JetBrains Mono"/>
+                <w:color w:val="17261F"/>
+                <w:sz w:val="16"/>
+                <w:szCs w:val="16"/>
+              </w:rPr>
+              <w:t xml:space="preserve">  CROPS {</w:t>
+            </w:r>
+          </w:p>
+          <w:p>
+            <w:pPr>
+              <w:spacing w:before="0" w:after="0" w:line="252" w:lineRule="auto"/>
+            </w:pPr>
+            <w:r>
+              <w:rPr>
+                <w:rFonts w:ascii="JetBrains Mono" w:hAnsi="JetBrains Mono" w:eastAsia="JetBrains Mono" w:cs="JetBrains Mono"/>
+                <w:color w:val="17261F"/>
+                <w:sz w:val="16"/>
+                <w:szCs w:val="16"/>
+              </w:rPr>
+              <w:t xml:space="preserve">    ObjectId ownerId "obligatorio"</w:t>
+            </w:r>
+          </w:p>
+          <w:p>
+            <w:pPr>
+              <w:spacing w:before="0" w:after="0" w:line="252" w:lineRule="auto"/>
+            </w:pPr>
+            <w:r>
+              <w:rPr>
+                <w:rFonts w:ascii="JetBrains Mono" w:hAnsi="JetBrains Mono" w:eastAsia="JetBrains Mono" w:cs="JetBrains Mono"/>
+                <w:color w:val="17261F"/>
+                <w:sz w:val="16"/>
+                <w:szCs w:val="16"/>
+              </w:rPr>
+              <w:t xml:space="preserve">    string name "1 a 60"</w:t>
+            </w:r>
+          </w:p>
+          <w:p>
+            <w:pPr>
+              <w:spacing w:before="0" w:after="0" w:line="252" w:lineRule="auto"/>
+            </w:pPr>
+            <w:r>
+              <w:rPr>
+                <w:rFonts w:ascii="JetBrains Mono" w:hAnsi="JetBrains Mono" w:eastAsia="JetBrains Mono" w:cs="JetBrains Mono"/>
+                <w:color w:val="17261F"/>
+                <w:sz w:val="16"/>
+                <w:szCs w:val="16"/>
+              </w:rPr>
+              <w:t xml:space="preserve">    string type "seis especies"</w:t>
+            </w:r>
+          </w:p>
+          <w:p>
+            <w:pPr>
+              <w:spacing w:before="0" w:after="0" w:line="252" w:lineRule="auto"/>
+            </w:pPr>
+            <w:r>
+              <w:rPr>
+                <w:rFonts w:ascii="JetBrains Mono" w:hAnsi="JetBrains Mono" w:eastAsia="JetBrains Mono" w:cs="JetBrains Mono"/>
+                <w:color w:val="17261F"/>
+                <w:sz w:val="16"/>
+                <w:szCs w:val="16"/>
+              </w:rPr>
+              <w:t xml:space="preserve">    string kind "REAL o VIRTUAL"</w:t>
+            </w:r>
+          </w:p>
+          <w:p>
+            <w:pPr>
+              <w:spacing w:before="0" w:after="0" w:line="252" w:lineRule="auto"/>
+            </w:pPr>
+            <w:r>
+              <w:rPr>
+                <w:rFonts w:ascii="JetBrains Mono" w:hAnsi="JetBrains Mono" w:eastAsia="JetBrains Mono" w:cs="JetBrains Mono"/>
+                <w:color w:val="17261F"/>
+                <w:sz w:val="16"/>
+                <w:szCs w:val="16"/>
+              </w:rPr>
+              <w:t xml:space="preserve">    string form "POT, NFT, TOWER, RAFT"</w:t>
+            </w:r>
+          </w:p>
+          <w:p>
+            <w:pPr>
+              <w:spacing w:before="0" w:after="0" w:line="252" w:lineRule="auto"/>
+            </w:pPr>
+            <w:r>
+              <w:rPr>
+                <w:rFonts w:ascii="JetBrains Mono" w:hAnsi="JetBrains Mono" w:eastAsia="JetBrains Mono" w:cs="JetBrains Mono"/>
+                <w:color w:val="17261F"/>
+                <w:sz w:val="16"/>
+                <w:szCs w:val="16"/>
+              </w:rPr>
+              <w:t xml:space="preserve">    object placement "lugar, exposición y ubicación"</w:t>
+            </w:r>
+          </w:p>
+          <w:p>
+            <w:pPr>
+              <w:spacing w:before="0" w:after="0" w:line="252" w:lineRule="auto"/>
+            </w:pPr>
+            <w:r>
+              <w:rPr>
+                <w:rFonts w:ascii="JetBrains Mono" w:hAnsi="JetBrains Mono" w:eastAsia="JetBrains Mono" w:cs="JetBrains Mono"/>
+                <w:color w:val="17261F"/>
+                <w:sz w:val="16"/>
+                <w:szCs w:val="16"/>
+              </w:rPr>
+              <w:t xml:space="preserve">    bool automationEnabled "obligatorio"</w:t>
+            </w:r>
+          </w:p>
+          <w:p>
+            <w:pPr>
+              <w:spacing w:before="0" w:after="0" w:line="252" w:lineRule="auto"/>
+            </w:pPr>
+            <w:r>
+              <w:rPr>
+                <w:rFonts w:ascii="JetBrains Mono" w:hAnsi="JetBrains Mono" w:eastAsia="JetBrains Mono" w:cs="JetBrains Mono"/>
+                <w:color w:val="17261F"/>
+                <w:sz w:val="16"/>
+                <w:szCs w:val="16"/>
+              </w:rPr>
+              <w:t xml:space="preserve">    date createdAt "obligatorio"</w:t>
+            </w:r>
+          </w:p>
+          <w:p>
+            <w:pPr>
+              <w:spacing w:before="0" w:after="0" w:line="252" w:lineRule="auto"/>
+            </w:pPr>
+            <w:r>
+              <w:rPr>
+                <w:rFonts w:ascii="JetBrains Mono" w:hAnsi="JetBrains Mono" w:eastAsia="JetBrains Mono" w:cs="JetBrains Mono"/>
+                <w:color w:val="17261F"/>
+                <w:sz w:val="16"/>
+                <w:szCs w:val="16"/>
+              </w:rPr>
+              <w:t xml:space="preserve">  }</w:t>
+            </w:r>
+          </w:p>
+          <w:p>
+            <w:pPr>
+              <w:spacing w:before="0" w:after="0" w:line="252" w:lineRule="auto"/>
+            </w:pPr>
+            <w:r>
+              <w:rPr>
+                <w:rFonts w:ascii="JetBrains Mono" w:hAnsi="JetBrains Mono" w:eastAsia="JetBrains Mono" w:cs="JetBrains Mono"/>
+                <w:color w:val="17261F"/>
+                <w:sz w:val="16"/>
+                <w:szCs w:val="16"/>
+              </w:rPr>
+              <w:t xml:space="preserve">  READINGS {</w:t>
+            </w:r>
+          </w:p>
+          <w:p>
+            <w:pPr>
+              <w:spacing w:before="0" w:after="0" w:line="252" w:lineRule="auto"/>
+            </w:pPr>
+            <w:r>
+              <w:rPr>
+                <w:rFonts w:ascii="JetBrains Mono" w:hAnsi="JetBrains Mono" w:eastAsia="JetBrains Mono" w:cs="JetBrains Mono"/>
+                <w:color w:val="17261F"/>
+                <w:sz w:val="16"/>
+                <w:szCs w:val="16"/>
+              </w:rPr>
+              <w:t xml:space="preserve">    ObjectId cropId "obligatorio"</w:t>
+            </w:r>
+          </w:p>
+          <w:p>
+            <w:pPr>
+              <w:spacing w:before="0" w:after="0" w:line="252" w:lineRule="auto"/>
+            </w:pPr>
+            <w:r>
+              <w:rPr>
+                <w:rFonts w:ascii="JetBrains Mono" w:hAnsi="JetBrains Mono" w:eastAsia="JetBrains Mono" w:cs="JetBrains Mono"/>
+                <w:color w:val="17261F"/>
+                <w:sz w:val="16"/>
+                <w:szCs w:val="16"/>
+              </w:rPr>
+              <w:t xml:space="preserve">    date measuredAt "obligatorio"</w:t>
+            </w:r>
+          </w:p>
+          <w:p>
+            <w:pPr>
+              <w:spacing w:before="0" w:after="0" w:line="252" w:lineRule="auto"/>
+            </w:pPr>
+            <w:r>
+              <w:rPr>
+                <w:rFonts w:ascii="JetBrains Mono" w:hAnsi="JetBrains Mono" w:eastAsia="JetBrains Mono" w:cs="JetBrains Mono"/>
+                <w:color w:val="17261F"/>
+                <w:sz w:val="16"/>
+                <w:szCs w:val="16"/>
+              </w:rPr>
+              <w:t xml:space="preserve">    object measures "obligatorio"</w:t>
+            </w:r>
+          </w:p>
+          <w:p>
+            <w:pPr>
+              <w:spacing w:before="0" w:after="0" w:line="252" w:lineRule="auto"/>
+            </w:pPr>
+            <w:r>
+              <w:rPr>
+                <w:rFonts w:ascii="JetBrains Mono" w:hAnsi="JetBrains Mono" w:eastAsia="JetBrains Mono" w:cs="JetBrains Mono"/>
+                <w:color w:val="17261F"/>
+                <w:sz w:val="16"/>
+                <w:szCs w:val="16"/>
+              </w:rPr>
+              <w:t xml:space="preserve">    string source "MQTT o HTTP"</w:t>
+            </w:r>
+          </w:p>
+          <w:p>
+            <w:pPr>
+              <w:spacing w:before="0" w:after="0" w:line="252" w:lineRule="auto"/>
+            </w:pPr>
+            <w:r>
+              <w:rPr>
+                <w:rFonts w:ascii="JetBrains Mono" w:hAnsi="JetBrains Mono" w:eastAsia="JetBrains Mono" w:cs="JetBrains Mono"/>
+                <w:color w:val="17261F"/>
+                <w:sz w:val="16"/>
+                <w:szCs w:val="16"/>
+              </w:rPr>
+              <w:t xml:space="preserve">  }</w:t>
+            </w:r>
+          </w:p>
+          <w:p>
+            <w:pPr>
+              <w:spacing w:before="0" w:after="0" w:line="252" w:lineRule="auto"/>
+            </w:pPr>
+            <w:r>
+              <w:rPr>
+                <w:rFonts w:ascii="JetBrains Mono" w:hAnsi="JetBrains Mono" w:eastAsia="JetBrains Mono" w:cs="JetBrains Mono"/>
+                <w:color w:val="17261F"/>
+                <w:sz w:val="16"/>
+                <w:szCs w:val="16"/>
+              </w:rPr>
+              <w:t xml:space="preserve">  CROP_CHANNELS {</w:t>
+            </w:r>
+          </w:p>
+          <w:p>
+            <w:pPr>
+              <w:spacing w:before="0" w:after="0" w:line="252" w:lineRule="auto"/>
+            </w:pPr>
+            <w:r>
+              <w:rPr>
+                <w:rFonts w:ascii="JetBrains Mono" w:hAnsi="JetBrains Mono" w:eastAsia="JetBrains Mono" w:cs="JetBrains Mono"/>
+                <w:color w:val="17261F"/>
+                <w:sz w:val="16"/>
+                <w:szCs w:val="16"/>
+              </w:rPr>
+              <w:t xml:space="preserve">    ObjectId cropId "obligatorio"</w:t>
+            </w:r>
+          </w:p>
+          <w:p>
+            <w:pPr>
+              <w:spacing w:before="0" w:after="0" w:line="252" w:lineRule="auto"/>
+            </w:pPr>
+            <w:r>
+              <w:rPr>
+                <w:rFonts w:ascii="JetBrains Mono" w:hAnsi="JetBrains Mono" w:eastAsia="JetBrains Mono" w:cs="JetBrains Mono"/>
+                <w:color w:val="17261F"/>
+                <w:sz w:val="16"/>
+                <w:szCs w:val="16"/>
+              </w:rPr>
+              <w:t xml:space="preserve">    ObjectId ownerId "obligatorio"</w:t>
+            </w:r>
+          </w:p>
+          <w:p>
+            <w:pPr>
+              <w:spacing w:before="0" w:after="0" w:line="252" w:lineRule="auto"/>
+            </w:pPr>
+            <w:r>
+              <w:rPr>
+                <w:rFonts w:ascii="JetBrains Mono" w:hAnsi="JetBrains Mono" w:eastAsia="JetBrains Mono" w:cs="JetBrains Mono"/>
+                <w:color w:val="17261F"/>
+                <w:sz w:val="16"/>
+                <w:szCs w:val="16"/>
+              </w:rPr>
+              <w:t xml:space="preserve">    string type "TELEGRAM"</w:t>
+            </w:r>
+          </w:p>
+          <w:p>
+            <w:pPr>
+              <w:spacing w:before="0" w:after="0" w:line="252" w:lineRule="auto"/>
+            </w:pPr>
+            <w:r>
+              <w:rPr>
+                <w:rFonts w:ascii="JetBrains Mono" w:hAnsi="JetBrains Mono" w:eastAsia="JetBrains Mono" w:cs="JetBrains Mono"/>
+                <w:color w:val="17261F"/>
+                <w:sz w:val="16"/>
+                <w:szCs w:val="16"/>
+              </w:rPr>
+              <w:t xml:space="preserve">    bool enabled "obligatorio"</w:t>
+            </w:r>
+          </w:p>
+          <w:p>
+            <w:pPr>
+              <w:spacing w:before="0" w:after="0" w:line="252" w:lineRule="auto"/>
+            </w:pPr>
+            <w:r>
+              <w:rPr>
+                <w:rFonts w:ascii="JetBrains Mono" w:hAnsi="JetBrains Mono" w:eastAsia="JetBrains Mono" w:cs="JetBrains Mono"/>
+                <w:color w:val="17261F"/>
+                <w:sz w:val="16"/>
+                <w:szCs w:val="16"/>
+              </w:rPr>
+              <w:t xml:space="preserve">    string delivery "INSTANT o DIGEST"</w:t>
+            </w:r>
+          </w:p>
+          <w:p>
+            <w:pPr>
+              <w:spacing w:before="0" w:after="0" w:line="252" w:lineRule="auto"/>
+            </w:pPr>
+            <w:r>
+              <w:rPr>
+                <w:rFonts w:ascii="JetBrains Mono" w:hAnsi="JetBrains Mono" w:eastAsia="JetBrains Mono" w:cs="JetBrains Mono"/>
+                <w:color w:val="17261F"/>
+                <w:sz w:val="16"/>
+                <w:szCs w:val="16"/>
+              </w:rPr>
+              <w:t xml:space="preserve">    int digestHours "1 a 24"</w:t>
+            </w:r>
+          </w:p>
+          <w:p>
+            <w:pPr>
+              <w:spacing w:before="0" w:after="0" w:line="252" w:lineRule="auto"/>
+            </w:pPr>
+            <w:r>
+              <w:rPr>
+                <w:rFonts w:ascii="JetBrains Mono" w:hAnsi="JetBrains Mono" w:eastAsia="JetBrains Mono" w:cs="JetBrains Mono"/>
+                <w:color w:val="17261F"/>
+                <w:sz w:val="16"/>
+                <w:szCs w:val="16"/>
+              </w:rPr>
+              <w:t xml:space="preserve">    string dailySummaryAt "HH:mm"</w:t>
+            </w:r>
+          </w:p>
+          <w:p>
+            <w:pPr>
+              <w:spacing w:before="0" w:after="0" w:line="252" w:lineRule="auto"/>
+            </w:pPr>
+            <w:r>
+              <w:rPr>
+                <w:rFonts w:ascii="JetBrains Mono" w:hAnsi="JetBrains Mono" w:eastAsia="JetBrains Mono" w:cs="JetBrains Mono"/>
+                <w:color w:val="17261F"/>
+                <w:sz w:val="16"/>
+                <w:szCs w:val="16"/>
+              </w:rPr>
+              <w:t xml:space="preserve">    array recipients "hasta 10"</w:t>
+            </w:r>
+          </w:p>
+          <w:p>
+            <w:pPr>
+              <w:spacing w:before="0" w:after="0" w:line="252" w:lineRule="auto"/>
+            </w:pPr>
+            <w:r>
+              <w:rPr>
+                <w:rFonts w:ascii="JetBrains Mono" w:hAnsi="JetBrains Mono" w:eastAsia="JetBrains Mono" w:cs="JetBrains Mono"/>
+                <w:color w:val="17261F"/>
+                <w:sz w:val="16"/>
+                <w:szCs w:val="16"/>
+              </w:rPr>
+              <w:t xml:space="preserve">  }</w:t>
+            </w:r>
+          </w:p>
+          <w:p>
+            <w:pPr>
+              <w:spacing w:before="0" w:after="0" w:line="252" w:lineRule="auto"/>
+            </w:pPr>
+            <w:r>
+              <w:rPr>
+                <w:rFonts w:ascii="JetBrains Mono" w:hAnsi="JetBrains Mono" w:eastAsia="JetBrains Mono" w:cs="JetBrains Mono"/>
+                <w:color w:val="17261F"/>
+                <w:sz w:val="16"/>
+                <w:szCs w:val="16"/>
+              </w:rPr>
+              <w:t xml:space="preserve">  VIRTUAL_DEVICES {</w:t>
+            </w:r>
+          </w:p>
+          <w:p>
+            <w:pPr>
+              <w:spacing w:before="0" w:after="0" w:line="252" w:lineRule="auto"/>
+            </w:pPr>
+            <w:r>
+              <w:rPr>
+                <w:rFonts w:ascii="JetBrains Mono" w:hAnsi="JetBrains Mono" w:eastAsia="JetBrains Mono" w:cs="JetBrains Mono"/>
+                <w:color w:val="17261F"/>
+                <w:sz w:val="16"/>
+                <w:szCs w:val="16"/>
+              </w:rPr>
+              <w:t xml:space="preserve">    ObjectId cropId "obligatorio"</w:t>
+            </w:r>
+          </w:p>
+          <w:p>
+            <w:pPr>
+              <w:spacing w:before="0" w:after="0" w:line="252" w:lineRule="auto"/>
+            </w:pPr>
+            <w:r>
+              <w:rPr>
+                <w:rFonts w:ascii="JetBrains Mono" w:hAnsi="JetBrains Mono" w:eastAsia="JetBrains Mono" w:cs="JetBrains Mono"/>
+                <w:color w:val="17261F"/>
+                <w:sz w:val="16"/>
+                <w:szCs w:val="16"/>
+              </w:rPr>
+              <w:t xml:space="preserve">    ObjectId ownerId "obligatorio"</w:t>
+            </w:r>
+          </w:p>
+          <w:p>
+            <w:pPr>
+              <w:spacing w:before="0" w:after="0" w:line="252" w:lineRule="auto"/>
+            </w:pPr>
+            <w:r>
+              <w:rPr>
+                <w:rFonts w:ascii="JetBrains Mono" w:hAnsi="JetBrains Mono" w:eastAsia="JetBrains Mono" w:cs="JetBrains Mono"/>
+                <w:color w:val="17261F"/>
+                <w:sz w:val="16"/>
+                <w:szCs w:val="16"/>
+              </w:rPr>
+              <w:t xml:space="preserve">    string mode "AUTO, MANUAL, WEATHER"</w:t>
+            </w:r>
+          </w:p>
+          <w:p>
+            <w:pPr>
+              <w:spacing w:before="0" w:after="0" w:line="252" w:lineRule="auto"/>
+            </w:pPr>
+            <w:r>
+              <w:rPr>
+                <w:rFonts w:ascii="JetBrains Mono" w:hAnsi="JetBrains Mono" w:eastAsia="JetBrains Mono" w:cs="JetBrains Mono"/>
+                <w:color w:val="17261F"/>
+                <w:sz w:val="16"/>
+                <w:szCs w:val="16"/>
+              </w:rPr>
+              <w:t xml:space="preserve">    int intervalSeconds "10 a 300"</w:t>
+            </w:r>
+          </w:p>
+          <w:p>
+            <w:pPr>
+              <w:spacing w:before="0" w:after="0" w:line="252" w:lineRule="auto"/>
+            </w:pPr>
+            <w:r>
+              <w:rPr>
+                <w:rFonts w:ascii="JetBrains Mono" w:hAnsi="JetBrains Mono" w:eastAsia="JetBrains Mono" w:cs="JetBrains Mono"/>
+                <w:color w:val="17261F"/>
+                <w:sz w:val="16"/>
+                <w:szCs w:val="16"/>
+              </w:rPr>
+              <w:t xml:space="preserve">    bool active "false en pausa"</w:t>
+            </w:r>
+          </w:p>
+          <w:p>
+            <w:pPr>
+              <w:spacing w:before="0" w:after="0" w:line="252" w:lineRule="auto"/>
+            </w:pPr>
+            <w:r>
+              <w:rPr>
+                <w:rFonts w:ascii="JetBrains Mono" w:hAnsi="JetBrains Mono" w:eastAsia="JetBrains Mono" w:cs="JetBrains Mono"/>
+                <w:color w:val="17261F"/>
+                <w:sz w:val="16"/>
+                <w:szCs w:val="16"/>
+              </w:rPr>
+              <w:t xml:space="preserve">    object location "nombre, latitud, longitud"</w:t>
+            </w:r>
+          </w:p>
+          <w:p>
+            <w:pPr>
+              <w:spacing w:before="0" w:after="0" w:line="252" w:lineRule="auto"/>
+            </w:pPr>
+            <w:r>
+              <w:rPr>
+                <w:rFonts w:ascii="JetBrains Mono" w:hAnsi="JetBrains Mono" w:eastAsia="JetBrains Mono" w:cs="JetBrains Mono"/>
+                <w:color w:val="17261F"/>
+                <w:sz w:val="16"/>
+                <w:szCs w:val="16"/>
+              </w:rPr>
+              <w:t xml:space="preserve">  }</w:t>
+            </w:r>
+          </w:p>
+        </w:tc>
+      </w:tr>
+    </w:tbl>
+    <w:p>
+      <w:pPr>
+        <w:spacing w:before="160" w:after="0" w:line="240" w:lineRule="auto"/>
+        <w:rPr>
+          <w:sz w:val="8"/>
+        </w:rPr>
+      </w:pPr>
+    </w:p>
+    <w:p>
+      <w:pPr>
         <w:keepNext/>
         <w:spacing w:before="60" w:after="0" w:line="240" w:lineRule="auto"/>
         <w:rPr>
@@ -1610,8 +2916,8 @@
       </w:tblPr>
       <w:tblGrid>
         <w:gridCol w:w="2382"/>
-        <w:gridCol w:w="3835"/>
-        <w:gridCol w:w="3143"/>
+        <w:gridCol w:w="3346"/>
+        <w:gridCol w:w="3632"/>
       </w:tblGrid>
       <w:tr>
         <w:trPr>
@@ -1649,7 +2955,7 @@
         </w:tc>
         <w:tc>
           <w:tcPr>
-            <w:tcW w:w="3835" w:type="dxa"/>
+            <w:tcW w:w="3346" w:type="dxa"/>
             <w:shd w:val="clear" w:color="auto" w:fill="0B3D2B"/>
             <w:tcMar>
               <w:top w:w="70" w:type="dxa"/>
@@ -1678,7 +2984,7 @@
         </w:tc>
         <w:tc>
           <w:tcPr>
-            <w:tcW w:w="3143" w:type="dxa"/>
+            <w:tcW w:w="3632" w:type="dxa"/>
             <w:shd w:val="clear" w:color="auto" w:fill="0B3D2B"/>
             <w:tcMar>
               <w:top w:w="70" w:type="dxa"/>
@@ -1741,7 +3047,7 @@
         </w:tc>
         <w:tc>
           <w:tcPr>
-            <w:tcW w:w="3835" w:type="dxa"/>
+            <w:tcW w:w="3346" w:type="dxa"/>
             <w:shd w:val="clear" w:color="auto" w:fill="FFFFFF"/>
             <w:tcMar>
               <w:top w:w="70" w:type="dxa"/>
@@ -1819,7 +3125,7 @@
         </w:tc>
         <w:tc>
           <w:tcPr>
-            <w:tcW w:w="3143" w:type="dxa"/>
+            <w:tcW w:w="3632" w:type="dxa"/>
             <w:shd w:val="clear" w:color="auto" w:fill="FFFFFF"/>
             <w:tcMar>
               <w:top w:w="70" w:type="dxa"/>
@@ -1905,7 +3211,7 @@
         </w:tc>
         <w:tc>
           <w:tcPr>
-            <w:tcW w:w="3835" w:type="dxa"/>
+            <w:tcW w:w="3346" w:type="dxa"/>
             <w:shd w:val="clear" w:color="auto" w:fill="F2F7F4"/>
             <w:tcMar>
               <w:top w:w="70" w:type="dxa"/>
@@ -2000,7 +3306,7 @@
         </w:tc>
         <w:tc>
           <w:tcPr>
-            <w:tcW w:w="3143" w:type="dxa"/>
+            <w:tcW w:w="3632" w:type="dxa"/>
             <w:shd w:val="clear" w:color="auto" w:fill="F2F7F4"/>
             <w:tcMar>
               <w:top w:w="70" w:type="dxa"/>
@@ -2149,6 +3455,31 @@
                 <w:szCs w:val="15"/>
               </w:rPr>
               <w:t xml:space="preserve">RAFT</w:t>
+            </w:r>
+            <w:r>
+              <w:rPr>
+                <w:color w:val="17261F"/>
+                <w:sz w:val="17"/>
+                <w:szCs w:val="17"/>
+              </w:rPr>
+              <w:t xml:space="preserve">; </w:t>
+            </w:r>
+            <w:r>
+              <w:rPr>
+                <w:rFonts w:ascii="JetBrains Mono" w:hAnsi="JetBrains Mono" w:eastAsia="JetBrains Mono" w:cs="JetBrains Mono"/>
+                <w:color w:val="0A5A3C"/>
+                <w:sz w:val="15"/>
+                <w:szCs w:val="15"/>
+              </w:rPr>
+              <w:t xml:space="preserve">placement</w:t>
+            </w:r>
+            <w:r>
+              <w:rPr>
+                <w:color w:val="17261F"/>
+                <w:sz w:val="17"/>
+                <w:szCs w:val="17"/>
+              </w:rPr>
+              <w:t xml:space="preserve"> con lugar, exposición y coordenadas válidas</w:t>
             </w:r>
           </w:p>
         </w:tc>
@@ -2188,7 +3519,7 @@
         </w:tc>
         <w:tc>
           <w:tcPr>
-            <w:tcW w:w="3835" w:type="dxa"/>
+            <w:tcW w:w="3346" w:type="dxa"/>
             <w:shd w:val="clear" w:color="auto" w:fill="FFFFFF"/>
             <w:tcMar>
               <w:top w:w="70" w:type="dxa"/>
@@ -2249,7 +3580,7 @@
         </w:tc>
         <w:tc>
           <w:tcPr>
-            <w:tcW w:w="3143" w:type="dxa"/>
+            <w:tcW w:w="3632" w:type="dxa"/>
             <w:shd w:val="clear" w:color="auto" w:fill="FFFFFF"/>
             <w:tcMar>
               <w:top w:w="70" w:type="dxa"/>
@@ -2343,7 +3674,7 @@
         </w:tc>
         <w:tc>
           <w:tcPr>
-            <w:tcW w:w="3835" w:type="dxa"/>
+            <w:tcW w:w="3346" w:type="dxa"/>
             <w:shd w:val="clear" w:color="auto" w:fill="F2F7F4"/>
             <w:tcMar>
               <w:top w:w="70" w:type="dxa"/>
@@ -2404,7 +3735,7 @@
         </w:tc>
         <w:tc>
           <w:tcPr>
-            <w:tcW w:w="3143" w:type="dxa"/>
+            <w:tcW w:w="3632" w:type="dxa"/>
             <w:shd w:val="clear" w:color="auto" w:fill="F2F7F4"/>
             <w:tcMar>
               <w:top w:w="70" w:type="dxa"/>
@@ -2464,7 +3795,7 @@
         </w:tc>
         <w:tc>
           <w:tcPr>
-            <w:tcW w:w="3835" w:type="dxa"/>
+            <w:tcW w:w="3346" w:type="dxa"/>
             <w:shd w:val="clear" w:color="auto" w:fill="FFFFFF"/>
             <w:tcMar>
               <w:top w:w="70" w:type="dxa"/>
@@ -2593,7 +3924,7 @@
         </w:tc>
         <w:tc>
           <w:tcPr>
-            <w:tcW w:w="3143" w:type="dxa"/>
+            <w:tcW w:w="3632" w:type="dxa"/>
             <w:shd w:val="clear" w:color="auto" w:fill="FFFFFF"/>
             <w:tcMar>
               <w:top w:w="70" w:type="dxa"/>
@@ -2653,7 +3984,7 @@
         </w:tc>
         <w:tc>
           <w:tcPr>
-            <w:tcW w:w="3835" w:type="dxa"/>
+            <w:tcW w:w="3346" w:type="dxa"/>
             <w:shd w:val="clear" w:color="auto" w:fill="F2F7F4"/>
             <w:tcMar>
               <w:top w:w="70" w:type="dxa"/>
@@ -2765,7 +4096,7 @@
         </w:tc>
         <w:tc>
           <w:tcPr>
-            <w:tcW w:w="3143" w:type="dxa"/>
+            <w:tcW w:w="3632" w:type="dxa"/>
             <w:shd w:val="clear" w:color="auto" w:fill="F2F7F4"/>
             <w:tcMar>
               <w:top w:w="70" w:type="dxa"/>
@@ -2825,7 +4156,7 @@
         </w:tc>
         <w:tc>
           <w:tcPr>
-            <w:tcW w:w="3835" w:type="dxa"/>
+            <w:tcW w:w="3346" w:type="dxa"/>
             <w:shd w:val="clear" w:color="auto" w:fill="FFFFFF"/>
             <w:tcMar>
               <w:top w:w="70" w:type="dxa"/>
@@ -2886,7 +4217,7 @@
         </w:tc>
         <w:tc>
           <w:tcPr>
-            <w:tcW w:w="3143" w:type="dxa"/>
+            <w:tcW w:w="3632" w:type="dxa"/>
             <w:shd w:val="clear" w:color="auto" w:fill="FFFFFF"/>
             <w:tcMar>
               <w:top w:w="70" w:type="dxa"/>
@@ -2946,7 +4277,7 @@
         </w:tc>
         <w:tc>
           <w:tcPr>
-            <w:tcW w:w="3835" w:type="dxa"/>
+            <w:tcW w:w="3346" w:type="dxa"/>
             <w:shd w:val="clear" w:color="auto" w:fill="F2F7F4"/>
             <w:tcMar>
               <w:top w:w="70" w:type="dxa"/>
@@ -3075,7 +4406,7 @@
         </w:tc>
         <w:tc>
           <w:tcPr>
-            <w:tcW w:w="3143" w:type="dxa"/>
+            <w:tcW w:w="3632" w:type="dxa"/>
             <w:shd w:val="clear" w:color="auto" w:fill="F2F7F4"/>
             <w:tcMar>
               <w:top w:w="70" w:type="dxa"/>
@@ -3138,13 +4469,13 @@
                 <w:sz w:val="15"/>
                 <w:szCs w:val="15"/>
               </w:rPr>
-              <w:t xml:space="preserve">virtual_devices</w:t>
-            </w:r>
-          </w:p>
-        </w:tc>
-        <w:tc>
-          <w:tcPr>
-            <w:tcW w:w="3835" w:type="dxa"/>
+              <w:t xml:space="preserve">crop_channels</w:t>
+            </w:r>
+          </w:p>
+        </w:tc>
+        <w:tc>
+          <w:tcPr>
+            <w:tcW w:w="3346" w:type="dxa"/>
             <w:shd w:val="clear" w:color="auto" w:fill="FFFFFF"/>
             <w:tcMar>
               <w:top w:w="70" w:type="dxa"/>
@@ -3199,6 +4530,204 @@
                 <w:sz w:val="15"/>
                 <w:szCs w:val="15"/>
               </w:rPr>
+              <w:t xml:space="preserve">type</w:t>
+            </w:r>
+            <w:r>
+              <w:rPr>
+                <w:color w:val="17261F"/>
+                <w:sz w:val="17"/>
+                <w:szCs w:val="17"/>
+              </w:rPr>
+              <w:t xml:space="preserve">, </w:t>
+            </w:r>
+            <w:r>
+              <w:rPr>
+                <w:rFonts w:ascii="JetBrains Mono" w:hAnsi="JetBrains Mono" w:eastAsia="JetBrains Mono" w:cs="JetBrains Mono"/>
+                <w:color w:val="0A5A3C"/>
+                <w:sz w:val="15"/>
+                <w:szCs w:val="15"/>
+              </w:rPr>
+              <w:t xml:space="preserve">enabled</w:t>
+            </w:r>
+            <w:r>
+              <w:rPr>
+                <w:color w:val="17261F"/>
+                <w:sz w:val="17"/>
+                <w:szCs w:val="17"/>
+              </w:rPr>
+              <w:t xml:space="preserve">, </w:t>
+            </w:r>
+            <w:r>
+              <w:rPr>
+                <w:rFonts w:ascii="JetBrains Mono" w:hAnsi="JetBrains Mono" w:eastAsia="JetBrains Mono" w:cs="JetBrains Mono"/>
+                <w:color w:val="0A5A3C"/>
+                <w:sz w:val="15"/>
+                <w:szCs w:val="15"/>
+              </w:rPr>
+              <w:t xml:space="preserve">delivery</w:t>
+            </w:r>
+          </w:p>
+        </w:tc>
+        <w:tc>
+          <w:tcPr>
+            <w:tcW w:w="3632" w:type="dxa"/>
+            <w:shd w:val="clear" w:color="auto" w:fill="FFFFFF"/>
+            <w:tcMar>
+              <w:top w:w="70" w:type="dxa"/>
+              <w:left w:w="110" w:type="dxa"/>
+              <w:bottom w:w="70" w:type="dxa"/>
+              <w:right w:w="110" w:type="dxa"/>
+            </w:tcMar>
+            <w:vAlign w:val="center"/>
+          </w:tcPr>
+          <w:p>
+            <w:pPr>
+              <w:spacing w:before="0" w:after="0" w:line="252" w:lineRule="auto"/>
+            </w:pPr>
+            <w:r>
+              <w:rPr>
+                <w:rFonts w:ascii="JetBrains Mono" w:hAnsi="JetBrains Mono" w:eastAsia="JetBrains Mono" w:cs="JetBrains Mono"/>
+                <w:color w:val="0A5A3C"/>
+                <w:sz w:val="15"/>
+                <w:szCs w:val="15"/>
+              </w:rPr>
+              <w:t xml:space="preserve">INSTANT</w:t>
+            </w:r>
+            <w:r>
+              <w:rPr>
+                <w:color w:val="17261F"/>
+                <w:sz w:val="17"/>
+                <w:szCs w:val="17"/>
+              </w:rPr>
+              <w:t xml:space="preserve"> o </w:t>
+            </w:r>
+            <w:r>
+              <w:rPr>
+                <w:rFonts w:ascii="JetBrains Mono" w:hAnsi="JetBrains Mono" w:eastAsia="JetBrains Mono" w:cs="JetBrains Mono"/>
+                <w:color w:val="0A5A3C"/>
+                <w:sz w:val="15"/>
+                <w:szCs w:val="15"/>
+              </w:rPr>
+              <w:t xml:space="preserve">DIGEST</w:t>
+            </w:r>
+            <w:r>
+              <w:rPr>
+                <w:color w:val="17261F"/>
+                <w:sz w:val="17"/>
+                <w:szCs w:val="17"/>
+              </w:rPr>
+              <w:t xml:space="preserve">; resumen cada 1 a 24 h; </w:t>
+            </w:r>
+            <w:r>
+              <w:rPr>
+                <w:rFonts w:ascii="JetBrains Mono" w:hAnsi="JetBrains Mono" w:eastAsia="JetBrains Mono" w:cs="JetBrains Mono"/>
+                <w:color w:val="0A5A3C"/>
+                <w:sz w:val="15"/>
+                <w:szCs w:val="15"/>
+              </w:rPr>
+              <w:t xml:space="preserve">HH:mm</w:t>
+            </w:r>
+            <w:r>
+              <w:rPr>
+                <w:color w:val="17261F"/>
+                <w:sz w:val="17"/>
+                <w:szCs w:val="17"/>
+              </w:rPr>
+              <w:t xml:space="preserve">; hasta 10 chats</w:t>
+            </w:r>
+          </w:p>
+        </w:tc>
+      </w:tr>
+      <w:tr>
+        <w:trPr>
+          <w:cantSplit/>
+        </w:trPr>
+        <w:tc>
+          <w:tcPr>
+            <w:tcW w:w="2382" w:type="dxa"/>
+            <w:shd w:val="clear" w:color="auto" w:fill="F2F7F4"/>
+            <w:tcMar>
+              <w:top w:w="70" w:type="dxa"/>
+              <w:left w:w="110" w:type="dxa"/>
+              <w:bottom w:w="70" w:type="dxa"/>
+              <w:right w:w="110" w:type="dxa"/>
+            </w:tcMar>
+            <w:vAlign w:val="center"/>
+          </w:tcPr>
+          <w:p>
+            <w:pPr>
+              <w:spacing w:before="0" w:after="0" w:line="252" w:lineRule="auto"/>
+            </w:pPr>
+            <w:r>
+              <w:rPr>
+                <w:rFonts w:ascii="JetBrains Mono" w:hAnsi="JetBrains Mono" w:eastAsia="JetBrains Mono" w:cs="JetBrains Mono"/>
+                <w:b/>
+                <w:bCs/>
+                <w:color w:val="0A5A3C"/>
+                <w:sz w:val="15"/>
+                <w:szCs w:val="15"/>
+              </w:rPr>
+              <w:t xml:space="preserve">virtual_devices</w:t>
+            </w:r>
+          </w:p>
+        </w:tc>
+        <w:tc>
+          <w:tcPr>
+            <w:tcW w:w="3346" w:type="dxa"/>
+            <w:shd w:val="clear" w:color="auto" w:fill="F2F7F4"/>
+            <w:tcMar>
+              <w:top w:w="70" w:type="dxa"/>
+              <w:left w:w="110" w:type="dxa"/>
+              <w:bottom w:w="70" w:type="dxa"/>
+              <w:right w:w="110" w:type="dxa"/>
+            </w:tcMar>
+            <w:vAlign w:val="center"/>
+          </w:tcPr>
+          <w:p>
+            <w:pPr>
+              <w:spacing w:before="0" w:after="0" w:line="252" w:lineRule="auto"/>
+            </w:pPr>
+            <w:r>
+              <w:rPr>
+                <w:rFonts w:ascii="JetBrains Mono" w:hAnsi="JetBrains Mono" w:eastAsia="JetBrains Mono" w:cs="JetBrains Mono"/>
+                <w:color w:val="0A5A3C"/>
+                <w:sz w:val="15"/>
+                <w:szCs w:val="15"/>
+              </w:rPr>
+              <w:t xml:space="preserve">cropId</w:t>
+            </w:r>
+            <w:r>
+              <w:rPr>
+                <w:color w:val="17261F"/>
+                <w:sz w:val="17"/>
+                <w:szCs w:val="17"/>
+              </w:rPr>
+              <w:t xml:space="preserve">, </w:t>
+            </w:r>
+            <w:r>
+              <w:rPr>
+                <w:rFonts w:ascii="JetBrains Mono" w:hAnsi="JetBrains Mono" w:eastAsia="JetBrains Mono" w:cs="JetBrains Mono"/>
+                <w:color w:val="0A5A3C"/>
+                <w:sz w:val="15"/>
+                <w:szCs w:val="15"/>
+              </w:rPr>
+              <w:t xml:space="preserve">ownerId</w:t>
+            </w:r>
+            <w:r>
+              <w:rPr>
+                <w:color w:val="17261F"/>
+                <w:sz w:val="17"/>
+                <w:szCs w:val="17"/>
+              </w:rPr>
+              <w:t xml:space="preserve">, </w:t>
+            </w:r>
+            <w:r>
+              <w:rPr>
+                <w:rFonts w:ascii="JetBrains Mono" w:hAnsi="JetBrains Mono" w:eastAsia="JetBrains Mono" w:cs="JetBrains Mono"/>
+                <w:color w:val="0A5A3C"/>
+                <w:sz w:val="15"/>
+                <w:szCs w:val="15"/>
+              </w:rPr>
               <w:t xml:space="preserve">mode</w:t>
             </w:r>
             <w:r>
@@ -3256,8 +4785,8 @@
         </w:tc>
         <w:tc>
           <w:tcPr>
-            <w:tcW w:w="3143" w:type="dxa"/>
-            <w:shd w:val="clear" w:color="auto" w:fill="FFFFFF"/>
+            <w:tcW w:w="3632" w:type="dxa"/>
+            <w:shd w:val="clear" w:color="auto" w:fill="F2F7F4"/>
             <w:tcMar>
               <w:top w:w="70" w:type="dxa"/>
               <w:left w:w="110" w:type="dxa"/>
@@ -3517,6 +5046,442 @@
         </w:rPr>
         <w:t xml:space="preserve">  ·  Migración de una base existente</w:t>
       </w:r>
+    </w:p>
+    <w:p>
+      <w:pPr>
+        <w:spacing w:before="80" w:after="0" w:line="240" w:lineRule="auto"/>
+        <w:rPr>
+          <w:sz w:val="8"/>
+        </w:rPr>
+      </w:pPr>
+    </w:p>
+    <w:tbl>
+      <w:tblPr>
+        <w:tblW w:w="9360" w:type="dxa"/>
+        <w:tblInd w:w="0" w:type="dxa"/>
+        <w:tblBorders>
+          <w:top w:val="nil"/>
+          <w:left w:val="nil"/>
+          <w:bottom w:val="nil"/>
+          <w:right w:val="nil"/>
+          <w:insideH w:val="nil"/>
+          <w:insideV w:val="nil"/>
+        </w:tblBorders>
+        <w:tblLayout w:type="fixed"/>
+        <w:tblCellMar>
+          <w:left w:w="0" w:type="dxa"/>
+          <w:right w:w="0" w:type="dxa"/>
+        </w:tblCellMar>
+        <w:tblLook w:val="0000" w:firstRow="0" w:lastRow="0" w:firstColumn="0" w:lastColumn="0" w:noHBand="1" w:noVBand="1"/>
+      </w:tblPr>
+      <w:tblGrid>
+        <w:gridCol w:w="9360"/>
+      </w:tblGrid>
+      <w:tr>
+        <w:trPr>
+          <w:cantSplit/>
+        </w:trPr>
+        <w:tc>
+          <w:tcPr>
+            <w:tcW w:w="9360" w:type="dxa"/>
+            <w:shd w:val="clear" w:color="auto" w:fill="0B3D2B"/>
+            <w:tcMar>
+              <w:top w:w="60" w:type="dxa"/>
+              <w:left w:w="200" w:type="dxa"/>
+              <w:bottom w:w="60" w:type="dxa"/>
+              <w:right w:w="200" w:type="dxa"/>
+            </w:tcMar>
+            <w:vAlign w:val="top"/>
+          </w:tcPr>
+          <w:p>
+            <w:pPr>
+              <w:spacing w:before="0" w:after="0" w:line="240" w:lineRule="auto"/>
+            </w:pPr>
+            <w:r>
+              <w:rPr>
+                <w:b/>
+                <w:bCs/>
+                <w:color w:val="7FDBB0"/>
+                <w:spacing w:val="40"/>
+                <w:sz w:val="14"/>
+                <w:szCs w:val="14"/>
+              </w:rPr>
+              <w:t xml:space="preserve">MERMAID</w:t>
+            </w:r>
+          </w:p>
+        </w:tc>
+      </w:tr>
+    </w:tbl>
+    <w:tbl>
+      <w:tblPr>
+        <w:tblW w:w="9360" w:type="dxa"/>
+        <w:tblInd w:w="0" w:type="dxa"/>
+        <w:tblBorders>
+          <w:top w:val="nil"/>
+          <w:left w:val="nil"/>
+          <w:bottom w:val="nil"/>
+          <w:right w:val="nil"/>
+          <w:insideH w:val="nil"/>
+          <w:insideV w:val="nil"/>
+        </w:tblBorders>
+        <w:tblLayout w:type="fixed"/>
+        <w:tblCellMar>
+          <w:left w:w="0" w:type="dxa"/>
+          <w:right w:w="0" w:type="dxa"/>
+        </w:tblCellMar>
+        <w:tblLook w:val="0000" w:firstRow="0" w:lastRow="0" w:firstColumn="0" w:lastColumn="0" w:noHBand="1" w:noVBand="1"/>
+      </w:tblPr>
+      <w:tblGrid>
+        <w:gridCol w:w="9360"/>
+      </w:tblGrid>
+      <w:tr>
+        <w:trPr>
+          <w:cantSplit/>
+        </w:trPr>
+        <w:tc>
+          <w:tcPr>
+            <w:tcW w:w="9360" w:type="dxa"/>
+            <w:shd w:val="clear" w:color="auto" w:fill="F7FAF8"/>
+            <w:tcMar>
+              <w:top w:w="120" w:type="dxa"/>
+              <w:left w:w="200" w:type="dxa"/>
+              <w:bottom w:w="120" w:type="dxa"/>
+              <w:right w:w="200" w:type="dxa"/>
+            </w:tcMar>
+            <w:vAlign w:val="top"/>
+          </w:tcPr>
+          <w:p>
+            <w:pPr>
+              <w:spacing w:before="0" w:after="0" w:line="252" w:lineRule="auto"/>
+            </w:pPr>
+            <w:r>
+              <w:rPr>
+                <w:rFonts w:ascii="JetBrains Mono" w:hAnsi="JetBrains Mono" w:eastAsia="JetBrains Mono" w:cs="JetBrains Mono"/>
+                <w:color w:val="17261F"/>
+                <w:sz w:val="16"/>
+                <w:szCs w:val="16"/>
+              </w:rPr>
+              <w:t xml:space="preserve">%%{init: {"theme": "base", "fontFamily": "Segoe UI, Arial, sans-serif", "themeVariables": {"fontFamily": "Segoe UI, Arial, sans-serif", "fontSize": "15px", "primaryColor": "#DDF5EA", "primaryTextColor": "#17261F", "primaryBorderColor": "#067A52", "secondaryColor": "#E3F2FB", "secondaryTextColor": "#17261F", "secondaryBorderColor": "#1F6FA0", "tertiaryColor": "#F2F7F4", "tertiaryTextColor": "#17261F", "tertiaryBorderColor": "#D5E3DC", "lineColor": "#5B6B63", "textColor": "#17261F", "mainBkg": "#DDF5EA", "nodeBorder": "#067A52", "clusterBkg": "#F7FAF8", "clusterBorder": "#D5E3DC", "edgeLabelBackground": "#FFFFFF", "actorBkg": "#067A52", "actorBorder": "#0B3D2B", "actorTextColor": "#FFFFFF", "actorLineColor": "#5B6B63", "signalColor": "#17261F", "signalTextColor": "#17261F", "labelBoxBkgColor": "#0B3D2B", "labelBoxBorderColor": "#0B3D2B", "labelTextColor": "#FFFFFF", "loopTextColor": "#0B3D2B", "noteBkgColor": "#FDF4DD", "noteBorderColor": "#C98D12", "noteTextColor": "#17261F", "activationBkgColor": "#DDF5EA", "activationBorderColor": "#067A52", "attributeBackgroundColorOdd": "#FFFFFF", "attributeBackgroundColorEven": "#F2F7F4"}}}%%</w:t>
+            </w:r>
+          </w:p>
+          <w:p>
+            <w:pPr>
+              <w:spacing w:before="0" w:after="0" w:line="252" w:lineRule="auto"/>
+            </w:pPr>
+            <w:r>
+              <w:rPr>
+                <w:rFonts w:ascii="JetBrains Mono" w:hAnsi="JetBrains Mono" w:eastAsia="JetBrains Mono" w:cs="JetBrains Mono"/>
+                <w:color w:val="17261F"/>
+                <w:sz w:val="16"/>
+                <w:szCs w:val="16"/>
+              </w:rPr>
+              <w:t xml:space="preserve">flowchart TB</w:t>
+            </w:r>
+          </w:p>
+          <w:p>
+            <w:pPr>
+              <w:spacing w:before="0" w:after="0" w:line="252" w:lineRule="auto"/>
+            </w:pPr>
+            <w:r>
+              <w:rPr>
+                <w:rFonts w:ascii="JetBrains Mono" w:hAnsi="JetBrains Mono" w:eastAsia="JetBrains Mono" w:cs="JetBrains Mono"/>
+                <w:color w:val="17261F"/>
+                <w:sz w:val="16"/>
+                <w:szCs w:val="16"/>
+              </w:rPr>
+              <w:t xml:space="preserve">  start(["mongosh /opt/smartpot/migrate.js"]) --&gt; auth["Se autentica con la root del entorno&lt;br/&gt;MONGO_INITDB_ROOT_USERNAME y PASSWORD"]</w:t>
+            </w:r>
+          </w:p>
+          <w:p>
+            <w:pPr>
+              <w:spacing w:before="0" w:after="0" w:line="252" w:lineRule="auto"/>
+            </w:pPr>
+            <w:r>
+              <w:rPr>
+                <w:rFonts w:ascii="JetBrains Mono" w:hAnsi="JetBrains Mono" w:eastAsia="JetBrains Mono" w:cs="JetBrains Mono"/>
+                <w:color w:val="17261F"/>
+                <w:sz w:val="16"/>
+                <w:szCs w:val="16"/>
+              </w:rPr>
+              <w:t xml:space="preserve">  auth --&gt; each{"Por cada una de las 10 colecciones"}</w:t>
+            </w:r>
+          </w:p>
+          <w:p>
+            <w:pPr>
+              <w:spacing w:before="0" w:after="0" w:line="252" w:lineRule="auto"/>
+            </w:pPr>
+            <w:r>
+              <w:rPr>
+                <w:rFonts w:ascii="JetBrains Mono" w:hAnsi="JetBrains Mono" w:eastAsia="JetBrains Mono" w:cs="JetBrains Mono"/>
+                <w:color w:val="17261F"/>
+                <w:sz w:val="16"/>
+                <w:szCs w:val="16"/>
+              </w:rPr>
+              <w:t xml:space="preserve">  each --&gt; exists{"¿Existe?"}</w:t>
+            </w:r>
+          </w:p>
+          <w:p>
+            <w:pPr>
+              <w:spacing w:before="0" w:after="0" w:line="252" w:lineRule="auto"/>
+            </w:pPr>
+            <w:r>
+              <w:rPr>
+                <w:rFonts w:ascii="JetBrains Mono" w:hAnsi="JetBrains Mono" w:eastAsia="JetBrains Mono" w:cs="JetBrains Mono"/>
+                <w:color w:val="17261F"/>
+                <w:sz w:val="16"/>
+                <w:szCs w:val="16"/>
+              </w:rPr>
+              <w:t xml:space="preserve">  exists --&gt;|"No"| create["createCollection con el validador&lt;br/&gt;validationLevel strict"]</w:t>
+            </w:r>
+          </w:p>
+          <w:p>
+            <w:pPr>
+              <w:spacing w:before="0" w:after="0" w:line="252" w:lineRule="auto"/>
+            </w:pPr>
+            <w:r>
+              <w:rPr>
+                <w:rFonts w:ascii="JetBrains Mono" w:hAnsi="JetBrains Mono" w:eastAsia="JetBrains Mono" w:cs="JetBrains Mono"/>
+                <w:color w:val="17261F"/>
+                <w:sz w:val="16"/>
+                <w:szCs w:val="16"/>
+              </w:rPr>
+              <w:t xml:space="preserve">  exists --&gt;|"Sí"| count["Cuenta los documentos&lt;br/&gt;que no cumplen el esquema"]</w:t>
+            </w:r>
+          </w:p>
+          <w:p>
+            <w:pPr>
+              <w:spacing w:before="0" w:after="0" w:line="252" w:lineRule="auto"/>
+            </w:pPr>
+            <w:r>
+              <w:rPr>
+                <w:rFonts w:ascii="JetBrains Mono" w:hAnsi="JetBrains Mono" w:eastAsia="JetBrains Mono" w:cs="JetBrains Mono"/>
+                <w:color w:val="17261F"/>
+                <w:sz w:val="16"/>
+                <w:szCs w:val="16"/>
+              </w:rPr>
+              <w:t xml:space="preserve">  count --&gt; invalid{"¿Hay inválidos?"}</w:t>
+            </w:r>
+          </w:p>
+          <w:p>
+            <w:pPr>
+              <w:spacing w:before="0" w:after="0" w:line="252" w:lineRule="auto"/>
+            </w:pPr>
+            <w:r>
+              <w:rPr>
+                <w:rFonts w:ascii="JetBrains Mono" w:hAnsi="JetBrains Mono" w:eastAsia="JetBrains Mono" w:cs="JetBrains Mono"/>
+                <w:color w:val="17261F"/>
+                <w:sz w:val="16"/>
+                <w:szCs w:val="16"/>
+              </w:rPr>
+              <w:t xml:space="preserve">  invalid --&gt;|"No"| strict["collMod · strict"]</w:t>
+            </w:r>
+          </w:p>
+          <w:p>
+            <w:pPr>
+              <w:spacing w:before="0" w:after="0" w:line="252" w:lineRule="auto"/>
+            </w:pPr>
+            <w:r>
+              <w:rPr>
+                <w:rFonts w:ascii="JetBrains Mono" w:hAnsi="JetBrains Mono" w:eastAsia="JetBrains Mono" w:cs="JetBrains Mono"/>
+                <w:color w:val="17261F"/>
+                <w:sz w:val="16"/>
+                <w:szCs w:val="16"/>
+              </w:rPr>
+              <w:t xml:space="preserve">  invalid --&gt;|"Sí"| moderate["collMod · moderate&lt;br/&gt;los antiguos se pueden seguir actualizando"]</w:t>
+            </w:r>
+          </w:p>
+          <w:p>
+            <w:pPr>
+              <w:spacing w:before="0" w:after="0" w:line="252" w:lineRule="auto"/>
+            </w:pPr>
+            <w:r>
+              <w:rPr>
+                <w:rFonts w:ascii="JetBrains Mono" w:hAnsi="JetBrains Mono" w:eastAsia="JetBrains Mono" w:cs="JetBrains Mono"/>
+                <w:color w:val="17261F"/>
+                <w:sz w:val="16"/>
+                <w:szCs w:val="16"/>
+              </w:rPr>
+              <w:t xml:space="preserve">  create &amp; strict &amp; moderate --&gt; report(["Informe por colección&lt;br/&gt;idempotente: repetirla no cambia nada"])</w:t>
+            </w:r>
+          </w:p>
+          <w:p>
+            <w:pPr>
+              <w:spacing w:before="0" w:after="0" w:line="252" w:lineRule="auto"/>
+            </w:pPr>
+            <w:r>
+              <w:rPr>
+                <w:rFonts w:ascii="JetBrains Mono" w:hAnsi="JetBrains Mono" w:eastAsia="JetBrains Mono" w:cs="JetBrains Mono"/>
+                <w:color w:val="17261F"/>
+                <w:sz w:val="16"/>
+                <w:szCs w:val="16"/>
+              </w:rPr>
+              <w:t xml:space="preserve">  classDef leaf fill:#DDF5EA,stroke:#067A52,color:#17261F</w:t>
+            </w:r>
+          </w:p>
+          <w:p>
+            <w:pPr>
+              <w:spacing w:before="0" w:after="0" w:line="252" w:lineRule="auto"/>
+            </w:pPr>
+            <w:r>
+              <w:rPr>
+                <w:rFonts w:ascii="JetBrains Mono" w:hAnsi="JetBrains Mono" w:eastAsia="JetBrains Mono" w:cs="JetBrains Mono"/>
+                <w:color w:val="17261F"/>
+                <w:sz w:val="16"/>
+                <w:szCs w:val="16"/>
+              </w:rPr>
+              <w:t xml:space="preserve">  classDef water fill:#E3F2FB,stroke:#1F6FA0,color:#17261F</w:t>
+            </w:r>
+          </w:p>
+          <w:p>
+            <w:pPr>
+              <w:spacing w:before="0" w:after="0" w:line="252" w:lineRule="auto"/>
+            </w:pPr>
+            <w:r>
+              <w:rPr>
+                <w:rFonts w:ascii="JetBrains Mono" w:hAnsi="JetBrains Mono" w:eastAsia="JetBrains Mono" w:cs="JetBrains Mono"/>
+                <w:color w:val="17261F"/>
+                <w:sz w:val="16"/>
+                <w:szCs w:val="16"/>
+              </w:rPr>
+              <w:t xml:space="preserve">  classDef sun fill:#FDF4DD,stroke:#C98D12,color:#17261F</w:t>
+            </w:r>
+          </w:p>
+          <w:p>
+            <w:pPr>
+              <w:spacing w:before="0" w:after="0" w:line="252" w:lineRule="auto"/>
+            </w:pPr>
+            <w:r>
+              <w:rPr>
+                <w:rFonts w:ascii="JetBrains Mono" w:hAnsi="JetBrains Mono" w:eastAsia="JetBrains Mono" w:cs="JetBrains Mono"/>
+                <w:color w:val="17261F"/>
+                <w:sz w:val="16"/>
+                <w:szCs w:val="16"/>
+              </w:rPr>
+              <w:t xml:space="preserve">  classDef clay fill:#FBE9E1,stroke:#B85A38,color:#17261F</w:t>
+            </w:r>
+          </w:p>
+          <w:p>
+            <w:pPr>
+              <w:spacing w:before="0" w:after="0" w:line="252" w:lineRule="auto"/>
+            </w:pPr>
+            <w:r>
+              <w:rPr>
+                <w:rFonts w:ascii="JetBrains Mono" w:hAnsi="JetBrains Mono" w:eastAsia="JetBrains Mono" w:cs="JetBrains Mono"/>
+                <w:color w:val="17261F"/>
+                <w:sz w:val="16"/>
+                <w:szCs w:val="16"/>
+              </w:rPr>
+              <w:t xml:space="preserve">  classDef core fill:#067A52,stroke:#0B3D2B,color:#FFFFFF</w:t>
+            </w:r>
+          </w:p>
+          <w:p>
+            <w:pPr>
+              <w:spacing w:before="0" w:after="0" w:line="252" w:lineRule="auto"/>
+            </w:pPr>
+            <w:r>
+              <w:rPr>
+                <w:rFonts w:ascii="JetBrains Mono" w:hAnsi="JetBrains Mono" w:eastAsia="JetBrains Mono" w:cs="JetBrains Mono"/>
+                <w:color w:val="17261F"/>
+                <w:sz w:val="16"/>
+                <w:szCs w:val="16"/>
+              </w:rPr>
+              <w:t xml:space="preserve">  classDef deep fill:#0B3D2B,stroke:#06281C,color:#FFFFFF</w:t>
+            </w:r>
+          </w:p>
+          <w:p>
+            <w:pPr>
+              <w:spacing w:before="0" w:after="0" w:line="252" w:lineRule="auto"/>
+            </w:pPr>
+            <w:r>
+              <w:rPr>
+                <w:rFonts w:ascii="JetBrains Mono" w:hAnsi="JetBrains Mono" w:eastAsia="JetBrains Mono" w:cs="JetBrains Mono"/>
+                <w:color w:val="17261F"/>
+                <w:sz w:val="16"/>
+                <w:szCs w:val="16"/>
+              </w:rPr>
+              <w:t xml:space="preserve">  classDef muted fill:#F2F7F4,stroke:#5B6B63,color:#17261F</w:t>
+            </w:r>
+          </w:p>
+          <w:p>
+            <w:pPr>
+              <w:spacing w:before="0" w:after="0" w:line="252" w:lineRule="auto"/>
+            </w:pPr>
+            <w:r>
+              <w:rPr>
+                <w:rFonts w:ascii="JetBrains Mono" w:hAnsi="JetBrains Mono" w:eastAsia="JetBrains Mono" w:cs="JetBrains Mono"/>
+                <w:color w:val="17261F"/>
+                <w:sz w:val="16"/>
+                <w:szCs w:val="16"/>
+              </w:rPr>
+              <w:t xml:space="preserve">  class start,report core</w:t>
+            </w:r>
+          </w:p>
+          <w:p>
+            <w:pPr>
+              <w:spacing w:before="0" w:after="0" w:line="252" w:lineRule="auto"/>
+            </w:pPr>
+            <w:r>
+              <w:rPr>
+                <w:rFonts w:ascii="JetBrains Mono" w:hAnsi="JetBrains Mono" w:eastAsia="JetBrains Mono" w:cs="JetBrains Mono"/>
+                <w:color w:val="17261F"/>
+                <w:sz w:val="16"/>
+                <w:szCs w:val="16"/>
+              </w:rPr>
+              <w:t xml:space="preserve">  class each,exists,invalid sun</w:t>
+            </w:r>
+          </w:p>
+          <w:p>
+            <w:pPr>
+              <w:spacing w:before="0" w:after="0" w:line="252" w:lineRule="auto"/>
+            </w:pPr>
+            <w:r>
+              <w:rPr>
+                <w:rFonts w:ascii="JetBrains Mono" w:hAnsi="JetBrains Mono" w:eastAsia="JetBrains Mono" w:cs="JetBrains Mono"/>
+                <w:color w:val="17261F"/>
+                <w:sz w:val="16"/>
+                <w:szCs w:val="16"/>
+              </w:rPr>
+              <w:t xml:space="preserve">  class auth,count muted</w:t>
+            </w:r>
+          </w:p>
+          <w:p>
+            <w:pPr>
+              <w:spacing w:before="0" w:after="0" w:line="252" w:lineRule="auto"/>
+            </w:pPr>
+            <w:r>
+              <w:rPr>
+                <w:rFonts w:ascii="JetBrains Mono" w:hAnsi="JetBrains Mono" w:eastAsia="JetBrains Mono" w:cs="JetBrains Mono"/>
+                <w:color w:val="17261F"/>
+                <w:sz w:val="16"/>
+                <w:szCs w:val="16"/>
+              </w:rPr>
+              <w:t xml:space="preserve">  class create,strict leaf</w:t>
+            </w:r>
+          </w:p>
+          <w:p>
+            <w:pPr>
+              <w:spacing w:before="0" w:after="0" w:line="252" w:lineRule="auto"/>
+            </w:pPr>
+            <w:r>
+              <w:rPr>
+                <w:rFonts w:ascii="JetBrains Mono" w:hAnsi="JetBrains Mono" w:eastAsia="JetBrains Mono" w:cs="JetBrains Mono"/>
+                <w:color w:val="17261F"/>
+                <w:sz w:val="16"/>
+                <w:szCs w:val="16"/>
+              </w:rPr>
+              <w:t xml:space="preserve">  class moderate clay</w:t>
+            </w:r>
+          </w:p>
+        </w:tc>
+      </w:tr>
+    </w:tbl>
+    <w:p>
+      <w:pPr>
+        <w:spacing w:before="160" w:after="0" w:line="240" w:lineRule="auto"/>
+        <w:rPr>
+          <w:sz w:val="8"/>
+        </w:rPr>
+      </w:pPr>
     </w:p>
     <w:p>
       <w:pPr>
@@ -3660,25 +5625,7 @@
           <w:sz w:val="20"/>
           <w:szCs w:val="20"/>
         </w:rPr>
-        <w:t xml:space="preserve"> (contraseña pública de la demo) con dos cultivos </w:t>
-      </w:r>
-      <w:r>
-        <w:rPr>
-          <w:b/>
-          <w:bCs/>
-          <w:color w:val="17261F"/>
-          <w:sz w:val="20"/>
-          <w:szCs w:val="20"/>
-        </w:rPr>
-        <w:t xml:space="preserve">reales</w:t>
-      </w:r>
-      <w:r>
-        <w:rPr>
-          <w:color w:val="17261F"/>
-          <w:sz w:val="20"/>
-          <w:szCs w:val="20"/>
-        </w:rPr>
-        <w:t xml:space="preserve"> que publica el simulador: lechugas en tubos NFT con modo automático y tomates cherry en maceta, cada uno con 48 horas de lecturas. Nunca se activa en producción.</w:t>
+        <w:t xml:space="preserve"> (contraseña pública de la demo) con dos cultivos * *reales** que publica el simulador: lechugas en tubos NFT con modo automático y tomates cherry en maceta, cada uno con 48 horas de lecturas. Nunca se activa en producción.</w:t>
       </w:r>
     </w:p>
     <w:p>
@@ -4132,7 +6079,7 @@
           <w:sz w:val="20"/>
           <w:szCs w:val="20"/>
         </w:rPr>
-        <w:t xml:space="preserve"> levanta la imagen y comprueba las nueve colecciones con sus validadores, los permisos del usuario de la aplicación, los datos demo y la migración sobre una base anterior (una colección sin validador y otra con un documento antiguo), incluida su idempotencia. En Git Bash de Windows: </w:t>
+        <w:t xml:space="preserve"> levanta la imagen y comprueba las diez colecciones con sus validadores (el lugar del cultivo y los avisos por cultivo incluidos), los permisos del usuario de la aplicación, los datos demo y la migración sobre una base anterior (una colección sin validador y otra con un documento antiguo), incluida su idempotencia. En Git Bash de Windows: </w:t>
       </w:r>
       <w:r>
         <w:rPr>
@@ -4808,7 +6755,7 @@
               <w:sz w:val="14"/>
               <w:szCs w:val="14"/>
             </w:rPr>
-            <w:t xml:space="preserve">SMARTPOT-DB · V1.0</w:t>
+            <w:t xml:space="preserve">SMARTPOT-DB · V1.1</w:t>
           </w:r>
         </w:p>
       </w:tc>

</xml_diff>